<commit_message>
Roadmap: remove shipped features, add eight new ideas
Co-Authored-By: Claude Opus 5.5 <noreply@anthropic.com>
</commit_message>
<xml_diff>
--- a/RichLife-Feature-Roadmap.docx
+++ b/RichLife-Feature-Roadmap.docx
@@ -47,7 +47,7 @@
           <w:sz w:val="20"/>
           <w:szCs w:val="20"/>
         </w:rPr>
-        <w:t xml:space="preserve">Prepared 8 October 2026 · idle/tycoon game (Angular + .NET)</w:t>
+        <w:t xml:space="preserve">Prepared 8 October 2026 · updated 9 October 2026 · idle/tycoon game (Angular + .NET)</w:t>
       </w:r>
     </w:p>
     <w:p>
@@ -84,7 +84,7 @@
           <w:sz w:val="22"/>
           <w:szCs w:val="22"/>
         </w:rPr>
-        <w:t xml:space="preserve">Several features build on code that already exists but is not exposed yet (automation, income upgrades, the marketplace, luxury assets). Those are marked in their "How" section and are cheaper than they look.</w:t>
+        <w:t xml:space="preserve">Updated 9 October 2026: the seven features shipped since the first version are removed from the list (see "Already shipped"), and eight new ideas are added, marked "New". Every new feature now needs its texts in English, French and Arabic. Some features build on code that already exists but is not exposed yet (income upgrades, the marketplace); those are marked in their "How" section and are cheaper than they look.</w:t>
       </w:r>
     </w:p>
     <w:p>
@@ -398,7 +398,7 @@
                 <w:sz w:val="20"/>
                 <w:szCs w:val="20"/>
               </w:rPr>
-              <w:t xml:space="preserve">Business automation (managers)</w:t>
+              <w:t xml:space="preserve">Upgrade base income ("side hustles")</w:t>
             </w:r>
           </w:p>
         </w:tc>
@@ -489,7 +489,7 @@
                 <w:sz w:val="20"/>
                 <w:szCs w:val="20"/>
               </w:rPr>
-              <w:t xml:space="preserve">Medium</w:t>
+              <w:t xml:space="preserve">Small</w:t>
             </w:r>
           </w:p>
         </w:tc>
@@ -553,7 +553,7 @@
                 <w:sz w:val="20"/>
                 <w:szCs w:val="20"/>
               </w:rPr>
-              <w:t xml:space="preserve">Upgrade base income ("side hustles")</w:t>
+              <w:t xml:space="preserve">Daily login rewards and streaks</w:t>
             </w:r>
           </w:p>
         </w:tc>
@@ -583,7 +583,7 @@
                 <w:sz w:val="20"/>
                 <w:szCs w:val="20"/>
               </w:rPr>
-              <w:t xml:space="preserve">Core gameplay</w:t>
+              <w:t xml:space="preserve">Engagement</w:t>
             </w:r>
           </w:p>
         </w:tc>
@@ -708,7 +708,7 @@
                 <w:sz w:val="20"/>
                 <w:szCs w:val="20"/>
               </w:rPr>
-              <w:t xml:space="preserve">Business levels</w:t>
+              <w:t xml:space="preserve">Installable mobile app (PWA) and notifications</w:t>
             </w:r>
           </w:p>
         </w:tc>
@@ -738,7 +738,7 @@
                 <w:sz w:val="20"/>
                 <w:szCs w:val="20"/>
               </w:rPr>
-              <w:t xml:space="preserve">Core gameplay</w:t>
+              <w:t xml:space="preserve">Platform</w:t>
             </w:r>
           </w:p>
         </w:tc>
@@ -751,7 +751,7 @@
               <w:bottom w:val="single" w:color="D4D9E3" w:sz="4"/>
               <w:right w:val="single" w:color="D4D9E3" w:sz="4"/>
             </w:tcBorders>
-            <w:shd w:fill="FEF3C7" w:color="auto" w:val="clear"/>
+            <w:shd w:fill="FDE2E2" w:color="auto" w:val="clear"/>
             <w:tcMar>
               <w:top w:type="dxa" w:w="80"/>
               <w:left w:type="dxa" w:w="120"/>
@@ -769,7 +769,7 @@
                 <w:sz w:val="20"/>
                 <w:szCs w:val="20"/>
               </w:rPr>
-              <w:t xml:space="preserve">Medium</w:t>
+              <w:t xml:space="preserve">High</w:t>
             </w:r>
           </w:p>
         </w:tc>
@@ -799,7 +799,7 @@
                 <w:sz w:val="20"/>
                 <w:szCs w:val="20"/>
               </w:rPr>
-              <w:t xml:space="preserve">Medium</w:t>
+              <w:t xml:space="preserve">Small</w:t>
             </w:r>
           </w:p>
         </w:tc>
@@ -863,7 +863,7 @@
                 <w:sz w:val="20"/>
                 <w:szCs w:val="20"/>
               </w:rPr>
-              <w:t xml:space="preserve">Daily login rewards and streaks</w:t>
+              <w:t xml:space="preserve">Account security</w:t>
             </w:r>
           </w:p>
         </w:tc>
@@ -893,7 +893,7 @@
                 <w:sz w:val="20"/>
                 <w:szCs w:val="20"/>
               </w:rPr>
-              <w:t xml:space="preserve">Engagement</w:t>
+              <w:t xml:space="preserve">Platform</w:t>
             </w:r>
           </w:p>
         </w:tc>
@@ -954,7 +954,7 @@
                 <w:sz w:val="20"/>
                 <w:szCs w:val="20"/>
               </w:rPr>
-              <w:t xml:space="preserve">Small</w:t>
+              <w:t xml:space="preserve">Medium</w:t>
             </w:r>
           </w:p>
         </w:tc>
@@ -1018,7 +1018,7 @@
                 <w:sz w:val="20"/>
                 <w:szCs w:val="20"/>
               </w:rPr>
-              <w:t xml:space="preserve">Achievements and milestones</w:t>
+              <w:t xml:space="preserve">Production reliability (new)</w:t>
             </w:r>
           </w:p>
         </w:tc>
@@ -1048,7 +1048,7 @@
                 <w:sz w:val="20"/>
                 <w:szCs w:val="20"/>
               </w:rPr>
-              <w:t xml:space="preserve">Engagement</w:t>
+              <w:t xml:space="preserve">Platform</w:t>
             </w:r>
           </w:p>
         </w:tc>
@@ -1061,7 +1061,7 @@
               <w:bottom w:val="single" w:color="D4D9E3" w:sz="4"/>
               <w:right w:val="single" w:color="D4D9E3" w:sz="4"/>
             </w:tcBorders>
-            <w:shd w:fill="FEF3C7" w:color="auto" w:val="clear"/>
+            <w:shd w:fill="FDE2E2" w:color="auto" w:val="clear"/>
             <w:tcMar>
               <w:top w:type="dxa" w:w="80"/>
               <w:left w:type="dxa" w:w="120"/>
@@ -1079,7 +1079,7 @@
                 <w:sz w:val="20"/>
                 <w:szCs w:val="20"/>
               </w:rPr>
-              <w:t xml:space="preserve">Medium</w:t>
+              <w:t xml:space="preserve">High</w:t>
             </w:r>
           </w:p>
         </w:tc>
@@ -1109,7 +1109,7 @@
                 <w:sz w:val="20"/>
                 <w:szCs w:val="20"/>
               </w:rPr>
-              <w:t xml:space="preserve">Medium</w:t>
+              <w:t xml:space="preserve">Small</w:t>
             </w:r>
           </w:p>
         </w:tc>
@@ -1173,7 +1173,7 @@
                 <w:sz w:val="20"/>
                 <w:szCs w:val="20"/>
               </w:rPr>
-              <w:t xml:space="preserve">Random events</w:t>
+              <w:t xml:space="preserve">Achievement rewards (new)</w:t>
             </w:r>
           </w:p>
         </w:tc>
@@ -1264,7 +1264,7 @@
                 <w:sz w:val="20"/>
                 <w:szCs w:val="20"/>
               </w:rPr>
-              <w:t xml:space="preserve">Medium</w:t>
+              <w:t xml:space="preserve">Small</w:t>
             </w:r>
           </w:p>
         </w:tc>
@@ -1328,7 +1328,7 @@
                 <w:sz w:val="20"/>
                 <w:szCs w:val="20"/>
               </w:rPr>
-              <w:t xml:space="preserve">Admin catalogue editor (UI)</w:t>
+              <w:t xml:space="preserve">Public player profiles (new)</w:t>
             </w:r>
           </w:p>
         </w:tc>
@@ -1358,7 +1358,7 @@
                 <w:sz w:val="20"/>
                 <w:szCs w:val="20"/>
               </w:rPr>
-              <w:t xml:space="preserve">Admin &amp; content</w:t>
+              <w:t xml:space="preserve">Social</w:t>
             </w:r>
           </w:p>
         </w:tc>
@@ -1419,7 +1419,7 @@
                 <w:sz w:val="20"/>
                 <w:szCs w:val="20"/>
               </w:rPr>
-              <w:t xml:space="preserve">Medium</w:t>
+              <w:t xml:space="preserve">Small</w:t>
             </w:r>
           </w:p>
         </w:tc>
@@ -1483,7 +1483,7 @@
                 <w:sz w:val="20"/>
                 <w:szCs w:val="20"/>
               </w:rPr>
-              <w:t xml:space="preserve">Player marketplace</w:t>
+              <w:t xml:space="preserve">Leaderboard upgrades</w:t>
             </w:r>
           </w:p>
         </w:tc>
@@ -1513,7 +1513,7 @@
                 <w:sz w:val="20"/>
                 <w:szCs w:val="20"/>
               </w:rPr>
-              <w:t xml:space="preserve">Economy</w:t>
+              <w:t xml:space="preserve">Social</w:t>
             </w:r>
           </w:p>
         </w:tc>
@@ -1526,7 +1526,7 @@
               <w:bottom w:val="single" w:color="D4D9E3" w:sz="4"/>
               <w:right w:val="single" w:color="D4D9E3" w:sz="4"/>
             </w:tcBorders>
-            <w:shd w:fill="E2E8F0" w:color="auto" w:val="clear"/>
+            <w:shd w:fill="FEF3C7" w:color="auto" w:val="clear"/>
             <w:tcMar>
               <w:top w:type="dxa" w:w="80"/>
               <w:left w:type="dxa" w:w="120"/>
@@ -1544,7 +1544,7 @@
                 <w:sz w:val="20"/>
                 <w:szCs w:val="20"/>
               </w:rPr>
-              <w:t xml:space="preserve">Low</w:t>
+              <w:t xml:space="preserve">Medium</w:t>
             </w:r>
           </w:p>
         </w:tc>
@@ -1574,7 +1574,7 @@
                 <w:sz w:val="20"/>
                 <w:szCs w:val="20"/>
               </w:rPr>
-              <w:t xml:space="preserve">Large</w:t>
+              <w:t xml:space="preserve">Small</w:t>
             </w:r>
           </w:p>
         </w:tc>
@@ -1638,7 +1638,7 @@
                 <w:sz w:val="20"/>
                 <w:szCs w:val="20"/>
               </w:rPr>
-              <w:t xml:space="preserve">Luxury assets (status items)</w:t>
+              <w:t xml:space="preserve">Onboarding tutorial</w:t>
             </w:r>
           </w:p>
         </w:tc>
@@ -1668,7 +1668,7 @@
                 <w:sz w:val="20"/>
                 <w:szCs w:val="20"/>
               </w:rPr>
-              <w:t xml:space="preserve">Economy</w:t>
+              <w:t xml:space="preserve">Platform</w:t>
             </w:r>
           </w:p>
         </w:tc>
@@ -1681,7 +1681,7 @@
               <w:bottom w:val="single" w:color="D4D9E3" w:sz="4"/>
               <w:right w:val="single" w:color="D4D9E3" w:sz="4"/>
             </w:tcBorders>
-            <w:shd w:fill="E2E8F0" w:color="auto" w:val="clear"/>
+            <w:shd w:fill="FEF3C7" w:color="auto" w:val="clear"/>
             <w:tcMar>
               <w:top w:type="dxa" w:w="80"/>
               <w:left w:type="dxa" w:w="120"/>
@@ -1699,7 +1699,7 @@
                 <w:sz w:val="20"/>
                 <w:szCs w:val="20"/>
               </w:rPr>
-              <w:t xml:space="preserve">Low</w:t>
+              <w:t xml:space="preserve">Medium</w:t>
             </w:r>
           </w:p>
         </w:tc>
@@ -1729,7 +1729,7 @@
                 <w:sz w:val="20"/>
                 <w:szCs w:val="20"/>
               </w:rPr>
-              <w:t xml:space="preserve">Medium</w:t>
+              <w:t xml:space="preserve">Small</w:t>
             </w:r>
           </w:p>
         </w:tc>
@@ -1793,7 +1793,7 @@
                 <w:sz w:val="20"/>
                 <w:szCs w:val="20"/>
               </w:rPr>
-              <w:t xml:space="preserve">Bank: loans and deposits</w:t>
+              <w:t xml:space="preserve">Manager upgrades (new)</w:t>
             </w:r>
           </w:p>
         </w:tc>
@@ -1823,7 +1823,7 @@
                 <w:sz w:val="20"/>
                 <w:szCs w:val="20"/>
               </w:rPr>
-              <w:t xml:space="preserve">Economy</w:t>
+              <w:t xml:space="preserve">Core gameplay</w:t>
             </w:r>
           </w:p>
         </w:tc>
@@ -1836,7 +1836,7 @@
               <w:bottom w:val="single" w:color="D4D9E3" w:sz="4"/>
               <w:right w:val="single" w:color="D4D9E3" w:sz="4"/>
             </w:tcBorders>
-            <w:shd w:fill="E2E8F0" w:color="auto" w:val="clear"/>
+            <w:shd w:fill="FEF3C7" w:color="auto" w:val="clear"/>
             <w:tcMar>
               <w:top w:type="dxa" w:w="80"/>
               <w:left w:type="dxa" w:w="120"/>
@@ -1854,7 +1854,7 @@
                 <w:sz w:val="20"/>
                 <w:szCs w:val="20"/>
               </w:rPr>
-              <w:t xml:space="preserve">Low</w:t>
+              <w:t xml:space="preserve">Medium</w:t>
             </w:r>
           </w:p>
         </w:tc>
@@ -1884,7 +1884,7 @@
                 <w:sz w:val="20"/>
                 <w:szCs w:val="20"/>
               </w:rPr>
-              <w:t xml:space="preserve">Large</w:t>
+              <w:t xml:space="preserve">Small</w:t>
             </w:r>
           </w:p>
         </w:tc>
@@ -1948,7 +1948,7 @@
                 <w:sz w:val="20"/>
                 <w:szCs w:val="20"/>
               </w:rPr>
-              <w:t xml:space="preserve">Leaderboard upgrades</w:t>
+              <w:t xml:space="preserve">Random events</w:t>
             </w:r>
           </w:p>
         </w:tc>
@@ -1978,7 +1978,7 @@
                 <w:sz w:val="20"/>
                 <w:szCs w:val="20"/>
               </w:rPr>
-              <w:t xml:space="preserve">Social</w:t>
+              <w:t xml:space="preserve">Engagement</w:t>
             </w:r>
           </w:p>
         </w:tc>
@@ -2039,7 +2039,7 @@
                 <w:sz w:val="20"/>
                 <w:szCs w:val="20"/>
               </w:rPr>
-              <w:t xml:space="preserve">Small</w:t>
+              <w:t xml:space="preserve">Medium</w:t>
             </w:r>
           </w:p>
         </w:tc>
@@ -2103,7 +2103,7 @@
                 <w:sz w:val="20"/>
                 <w:szCs w:val="20"/>
               </w:rPr>
-              <w:t xml:space="preserve">Player profile</w:t>
+              <w:t xml:space="preserve">Prestige perks (new)</w:t>
             </w:r>
           </w:p>
         </w:tc>
@@ -2133,7 +2133,7 @@
                 <w:sz w:val="20"/>
                 <w:szCs w:val="20"/>
               </w:rPr>
-              <w:t xml:space="preserve">Social</w:t>
+              <w:t xml:space="preserve">Core gameplay</w:t>
             </w:r>
           </w:p>
         </w:tc>
@@ -2194,7 +2194,7 @@
                 <w:sz w:val="20"/>
                 <w:szCs w:val="20"/>
               </w:rPr>
-              <w:t xml:space="preserve">Small</w:t>
+              <w:t xml:space="preserve">Medium</w:t>
             </w:r>
           </w:p>
         </w:tc>
@@ -2258,7 +2258,7 @@
                 <w:sz w:val="20"/>
                 <w:szCs w:val="20"/>
               </w:rPr>
-              <w:t xml:space="preserve">Friends and alliances</w:t>
+              <w:t xml:space="preserve">Sector synergies and luxury collections (new)</w:t>
             </w:r>
           </w:p>
         </w:tc>
@@ -2288,7 +2288,7 @@
                 <w:sz w:val="20"/>
                 <w:szCs w:val="20"/>
               </w:rPr>
-              <w:t xml:space="preserve">Social</w:t>
+              <w:t xml:space="preserve">Economy</w:t>
             </w:r>
           </w:p>
         </w:tc>
@@ -2301,7 +2301,7 @@
               <w:bottom w:val="single" w:color="D4D9E3" w:sz="4"/>
               <w:right w:val="single" w:color="D4D9E3" w:sz="4"/>
             </w:tcBorders>
-            <w:shd w:fill="E2E8F0" w:color="auto" w:val="clear"/>
+            <w:shd w:fill="FEF3C7" w:color="auto" w:val="clear"/>
             <w:tcMar>
               <w:top w:type="dxa" w:w="80"/>
               <w:left w:type="dxa" w:w="120"/>
@@ -2319,7 +2319,7 @@
                 <w:sz w:val="20"/>
                 <w:szCs w:val="20"/>
               </w:rPr>
-              <w:t xml:space="preserve">Low</w:t>
+              <w:t xml:space="preserve">Medium</w:t>
             </w:r>
           </w:p>
         </w:tc>
@@ -2349,7 +2349,7 @@
                 <w:sz w:val="20"/>
                 <w:szCs w:val="20"/>
               </w:rPr>
-              <w:t xml:space="preserve">Large</w:t>
+              <w:t xml:space="preserve">Medium</w:t>
             </w:r>
           </w:p>
         </w:tc>
@@ -2413,7 +2413,7 @@
                 <w:sz w:val="20"/>
                 <w:szCs w:val="20"/>
               </w:rPr>
-              <w:t xml:space="preserve">Installable mobile app (PWA) and notifications</w:t>
+              <w:t xml:space="preserve">Translated game content (new)</w:t>
             </w:r>
           </w:p>
         </w:tc>
@@ -2456,7 +2456,7 @@
               <w:bottom w:val="single" w:color="D4D9E3" w:sz="4"/>
               <w:right w:val="single" w:color="D4D9E3" w:sz="4"/>
             </w:tcBorders>
-            <w:shd w:fill="FDE2E2" w:color="auto" w:val="clear"/>
+            <w:shd w:fill="FEF3C7" w:color="auto" w:val="clear"/>
             <w:tcMar>
               <w:top w:type="dxa" w:w="80"/>
               <w:left w:type="dxa" w:w="120"/>
@@ -2474,7 +2474,7 @@
                 <w:sz w:val="20"/>
                 <w:szCs w:val="20"/>
               </w:rPr>
-              <w:t xml:space="preserve">High</w:t>
+              <w:t xml:space="preserve">Medium</w:t>
             </w:r>
           </w:p>
         </w:tc>
@@ -2504,7 +2504,7 @@
                 <w:sz w:val="20"/>
                 <w:szCs w:val="20"/>
               </w:rPr>
-              <w:t xml:space="preserve">Small</w:t>
+              <w:t xml:space="preserve">Medium</w:t>
             </w:r>
           </w:p>
         </w:tc>
@@ -2568,7 +2568,7 @@
                 <w:sz w:val="20"/>
                 <w:szCs w:val="20"/>
               </w:rPr>
-              <w:t xml:space="preserve">Onboarding tutorial</w:t>
+              <w:t xml:space="preserve">Statistics and charts</w:t>
             </w:r>
           </w:p>
         </w:tc>
@@ -2611,7 +2611,7 @@
               <w:bottom w:val="single" w:color="D4D9E3" w:sz="4"/>
               <w:right w:val="single" w:color="D4D9E3" w:sz="4"/>
             </w:tcBorders>
-            <w:shd w:fill="FEF3C7" w:color="auto" w:val="clear"/>
+            <w:shd w:fill="E2E8F0" w:color="auto" w:val="clear"/>
             <w:tcMar>
               <w:top w:type="dxa" w:w="80"/>
               <w:left w:type="dxa" w:w="120"/>
@@ -2629,37 +2629,37 @@
                 <w:sz w:val="20"/>
                 <w:szCs w:val="20"/>
               </w:rPr>
+              <w:t xml:space="preserve">Low</w:t>
+            </w:r>
+          </w:p>
+        </w:tc>
+        <w:tc>
+          <w:tcPr>
+            <w:tcW w:type="dxa" w:w="1500"/>
+            <w:tcBorders>
+              <w:top w:val="single" w:color="D4D9E3" w:sz="4"/>
+              <w:left w:val="single" w:color="D4D9E3" w:sz="4"/>
+              <w:bottom w:val="single" w:color="D4D9E3" w:sz="4"/>
+              <w:right w:val="single" w:color="D4D9E3" w:sz="4"/>
+            </w:tcBorders>
+            <w:tcMar>
+              <w:top w:type="dxa" w:w="80"/>
+              <w:left w:type="dxa" w:w="120"/>
+              <w:bottom w:type="dxa" w:w="80"/>
+              <w:right w:type="dxa" w:w="120"/>
+            </w:tcMar>
+          </w:tcPr>
+          <w:p>
+            <w:pPr>
+              <w:jc w:val="left"/>
+            </w:pPr>
+            <w:r>
+              <w:rPr>
+                <w:rFonts w:ascii="Calibri" w:cs="Calibri" w:eastAsia="Calibri" w:hAnsi="Calibri"/>
+                <w:sz w:val="20"/>
+                <w:szCs w:val="20"/>
+              </w:rPr>
               <w:t xml:space="preserve">Medium</w:t>
-            </w:r>
-          </w:p>
-        </w:tc>
-        <w:tc>
-          <w:tcPr>
-            <w:tcW w:type="dxa" w:w="1500"/>
-            <w:tcBorders>
-              <w:top w:val="single" w:color="D4D9E3" w:sz="4"/>
-              <w:left w:val="single" w:color="D4D9E3" w:sz="4"/>
-              <w:bottom w:val="single" w:color="D4D9E3" w:sz="4"/>
-              <w:right w:val="single" w:color="D4D9E3" w:sz="4"/>
-            </w:tcBorders>
-            <w:tcMar>
-              <w:top w:type="dxa" w:w="80"/>
-              <w:left w:type="dxa" w:w="120"/>
-              <w:bottom w:type="dxa" w:w="80"/>
-              <w:right w:type="dxa" w:w="120"/>
-            </w:tcMar>
-          </w:tcPr>
-          <w:p>
-            <w:pPr>
-              <w:jc w:val="left"/>
-            </w:pPr>
-            <w:r>
-              <w:rPr>
-                <w:rFonts w:ascii="Calibri" w:cs="Calibri" w:eastAsia="Calibri" w:hAnsi="Calibri"/>
-                <w:sz w:val="20"/>
-                <w:szCs w:val="20"/>
-              </w:rPr>
-              <w:t xml:space="preserve">Small</w:t>
             </w:r>
           </w:p>
         </w:tc>
@@ -2723,7 +2723,7 @@
                 <w:sz w:val="20"/>
                 <w:szCs w:val="20"/>
               </w:rPr>
-              <w:t xml:space="preserve">Statistics and charts</w:t>
+              <w:t xml:space="preserve">Dark mode</w:t>
             </w:r>
           </w:p>
         </w:tc>
@@ -2814,7 +2814,7 @@
                 <w:sz w:val="20"/>
                 <w:szCs w:val="20"/>
               </w:rPr>
-              <w:t xml:space="preserve">Medium</w:t>
+              <w:t xml:space="preserve">Small</w:t>
             </w:r>
           </w:p>
         </w:tc>
@@ -2878,7 +2878,7 @@
                 <w:sz w:val="20"/>
                 <w:szCs w:val="20"/>
               </w:rPr>
-              <w:t xml:space="preserve">French and Arabic languages</w:t>
+              <w:t xml:space="preserve">Admin announcements and audit log (new)</w:t>
             </w:r>
           </w:p>
         </w:tc>
@@ -2908,7 +2908,7 @@
                 <w:sz w:val="20"/>
                 <w:szCs w:val="20"/>
               </w:rPr>
-              <w:t xml:space="preserve">Platform</w:t>
+              <w:t xml:space="preserve">Admin &amp; content</w:t>
             </w:r>
           </w:p>
         </w:tc>
@@ -2921,7 +2921,7 @@
               <w:bottom w:val="single" w:color="D4D9E3" w:sz="4"/>
               <w:right w:val="single" w:color="D4D9E3" w:sz="4"/>
             </w:tcBorders>
-            <w:shd w:fill="FEF3C7" w:color="auto" w:val="clear"/>
+            <w:shd w:fill="E2E8F0" w:color="auto" w:val="clear"/>
             <w:tcMar>
               <w:top w:type="dxa" w:w="80"/>
               <w:left w:type="dxa" w:w="120"/>
@@ -2939,7 +2939,7 @@
                 <w:sz w:val="20"/>
                 <w:szCs w:val="20"/>
               </w:rPr>
-              <w:t xml:space="preserve">Medium</w:t>
+              <w:t xml:space="preserve">Low</w:t>
             </w:r>
           </w:p>
         </w:tc>
@@ -2969,7 +2969,7 @@
                 <w:sz w:val="20"/>
                 <w:szCs w:val="20"/>
               </w:rPr>
-              <w:t xml:space="preserve">Medium</w:t>
+              <w:t xml:space="preserve">Small</w:t>
             </w:r>
           </w:p>
         </w:tc>
@@ -3033,7 +3033,7 @@
                 <w:sz w:val="20"/>
                 <w:szCs w:val="20"/>
               </w:rPr>
-              <w:t xml:space="preserve">Dark mode</w:t>
+              <w:t xml:space="preserve">Player marketplace</w:t>
             </w:r>
           </w:p>
         </w:tc>
@@ -3063,7 +3063,7 @@
                 <w:sz w:val="20"/>
                 <w:szCs w:val="20"/>
               </w:rPr>
-              <w:t xml:space="preserve">Platform</w:t>
+              <w:t xml:space="preserve">Economy</w:t>
             </w:r>
           </w:p>
         </w:tc>
@@ -3124,7 +3124,7 @@
                 <w:sz w:val="20"/>
                 <w:szCs w:val="20"/>
               </w:rPr>
-              <w:t xml:space="preserve">Small</w:t>
+              <w:t xml:space="preserve">Large</w:t>
             </w:r>
           </w:p>
         </w:tc>
@@ -3188,7 +3188,7 @@
                 <w:sz w:val="20"/>
                 <w:szCs w:val="20"/>
               </w:rPr>
-              <w:t xml:space="preserve">Account security</w:t>
+              <w:t xml:space="preserve">Bank: loans and deposits</w:t>
             </w:r>
           </w:p>
         </w:tc>
@@ -3218,7 +3218,7 @@
                 <w:sz w:val="20"/>
                 <w:szCs w:val="20"/>
               </w:rPr>
-              <w:t xml:space="preserve">Platform</w:t>
+              <w:t xml:space="preserve">Economy</w:t>
             </w:r>
           </w:p>
         </w:tc>
@@ -3231,7 +3231,7 @@
               <w:bottom w:val="single" w:color="D4D9E3" w:sz="4"/>
               <w:right w:val="single" w:color="D4D9E3" w:sz="4"/>
             </w:tcBorders>
-            <w:shd w:fill="FDE2E2" w:color="auto" w:val="clear"/>
+            <w:shd w:fill="E2E8F0" w:color="auto" w:val="clear"/>
             <w:tcMar>
               <w:top w:type="dxa" w:w="80"/>
               <w:left w:type="dxa" w:w="120"/>
@@ -3249,7 +3249,7 @@
                 <w:sz w:val="20"/>
                 <w:szCs w:val="20"/>
               </w:rPr>
-              <w:t xml:space="preserve">High</w:t>
+              <w:t xml:space="preserve">Low</w:t>
             </w:r>
           </w:p>
         </w:tc>
@@ -3279,12 +3279,416 @@
                 <w:sz w:val="20"/>
                 <w:szCs w:val="20"/>
               </w:rPr>
-              <w:t xml:space="preserve">Medium</w:t>
+              <w:t xml:space="preserve">Large</w:t>
+            </w:r>
+          </w:p>
+        </w:tc>
+      </w:tr>
+      <w:tr>
+        <w:tc>
+          <w:tcPr>
+            <w:tcW w:type="dxa" w:w="900"/>
+            <w:tcBorders>
+              <w:top w:val="single" w:color="D4D9E3" w:sz="4"/>
+              <w:left w:val="single" w:color="D4D9E3" w:sz="4"/>
+              <w:bottom w:val="single" w:color="D4D9E3" w:sz="4"/>
+              <w:right w:val="single" w:color="D4D9E3" w:sz="4"/>
+            </w:tcBorders>
+            <w:tcMar>
+              <w:top w:type="dxa" w:w="80"/>
+              <w:left w:type="dxa" w:w="120"/>
+              <w:bottom w:type="dxa" w:w="80"/>
+              <w:right w:type="dxa" w:w="120"/>
+            </w:tcMar>
+          </w:tcPr>
+          <w:p>
+            <w:pPr>
+              <w:jc w:val="center"/>
+            </w:pPr>
+            <w:r>
+              <w:rPr>
+                <w:rFonts w:ascii="Calibri" w:cs="Calibri" w:eastAsia="Calibri" w:hAnsi="Calibri"/>
+                <w:sz w:val="20"/>
+                <w:szCs w:val="20"/>
+              </w:rPr>
+              <w:t xml:space="preserve">20</w:t>
+            </w:r>
+          </w:p>
+        </w:tc>
+        <w:tc>
+          <w:tcPr>
+            <w:tcW w:type="dxa" w:w="4138"/>
+            <w:tcBorders>
+              <w:top w:val="single" w:color="D4D9E3" w:sz="4"/>
+              <w:left w:val="single" w:color="D4D9E3" w:sz="4"/>
+              <w:bottom w:val="single" w:color="D4D9E3" w:sz="4"/>
+              <w:right w:val="single" w:color="D4D9E3" w:sz="4"/>
+            </w:tcBorders>
+            <w:tcMar>
+              <w:top w:type="dxa" w:w="80"/>
+              <w:left w:type="dxa" w:w="120"/>
+              <w:bottom w:type="dxa" w:w="80"/>
+              <w:right w:type="dxa" w:w="120"/>
+            </w:tcMar>
+          </w:tcPr>
+          <w:p>
+            <w:pPr>
+              <w:jc w:val="left"/>
+            </w:pPr>
+            <w:r>
+              <w:rPr>
+                <w:rFonts w:ascii="Calibri" w:cs="Calibri" w:eastAsia="Calibri" w:hAnsi="Calibri"/>
+                <w:b/>
+                <w:bCs/>
+                <w:sz w:val="20"/>
+                <w:szCs w:val="20"/>
+              </w:rPr>
+              <w:t xml:space="preserve">Friends and alliances</w:t>
+            </w:r>
+          </w:p>
+        </w:tc>
+        <w:tc>
+          <w:tcPr>
+            <w:tcW w:type="dxa" w:w="1900"/>
+            <w:tcBorders>
+              <w:top w:val="single" w:color="D4D9E3" w:sz="4"/>
+              <w:left w:val="single" w:color="D4D9E3" w:sz="4"/>
+              <w:bottom w:val="single" w:color="D4D9E3" w:sz="4"/>
+              <w:right w:val="single" w:color="D4D9E3" w:sz="4"/>
+            </w:tcBorders>
+            <w:tcMar>
+              <w:top w:type="dxa" w:w="80"/>
+              <w:left w:type="dxa" w:w="120"/>
+              <w:bottom w:type="dxa" w:w="80"/>
+              <w:right w:type="dxa" w:w="120"/>
+            </w:tcMar>
+          </w:tcPr>
+          <w:p>
+            <w:pPr>
+              <w:jc w:val="left"/>
+            </w:pPr>
+            <w:r>
+              <w:rPr>
+                <w:rFonts w:ascii="Calibri" w:cs="Calibri" w:eastAsia="Calibri" w:hAnsi="Calibri"/>
+                <w:sz w:val="20"/>
+                <w:szCs w:val="20"/>
+              </w:rPr>
+              <w:t xml:space="preserve">Social</w:t>
+            </w:r>
+          </w:p>
+        </w:tc>
+        <w:tc>
+          <w:tcPr>
+            <w:tcW w:type="dxa" w:w="1200"/>
+            <w:tcBorders>
+              <w:top w:val="single" w:color="D4D9E3" w:sz="4"/>
+              <w:left w:val="single" w:color="D4D9E3" w:sz="4"/>
+              <w:bottom w:val="single" w:color="D4D9E3" w:sz="4"/>
+              <w:right w:val="single" w:color="D4D9E3" w:sz="4"/>
+            </w:tcBorders>
+            <w:shd w:fill="E2E8F0" w:color="auto" w:val="clear"/>
+            <w:tcMar>
+              <w:top w:type="dxa" w:w="80"/>
+              <w:left w:type="dxa" w:w="120"/>
+              <w:bottom w:type="dxa" w:w="80"/>
+              <w:right w:type="dxa" w:w="120"/>
+            </w:tcMar>
+          </w:tcPr>
+          <w:p>
+            <w:pPr>
+              <w:jc w:val="left"/>
+            </w:pPr>
+            <w:r>
+              <w:rPr>
+                <w:rFonts w:ascii="Calibri" w:cs="Calibri" w:eastAsia="Calibri" w:hAnsi="Calibri"/>
+                <w:sz w:val="20"/>
+                <w:szCs w:val="20"/>
+              </w:rPr>
+              <w:t xml:space="preserve">Low</w:t>
+            </w:r>
+          </w:p>
+        </w:tc>
+        <w:tc>
+          <w:tcPr>
+            <w:tcW w:type="dxa" w:w="1500"/>
+            <w:tcBorders>
+              <w:top w:val="single" w:color="D4D9E3" w:sz="4"/>
+              <w:left w:val="single" w:color="D4D9E3" w:sz="4"/>
+              <w:bottom w:val="single" w:color="D4D9E3" w:sz="4"/>
+              <w:right w:val="single" w:color="D4D9E3" w:sz="4"/>
+            </w:tcBorders>
+            <w:tcMar>
+              <w:top w:type="dxa" w:w="80"/>
+              <w:left w:type="dxa" w:w="120"/>
+              <w:bottom w:type="dxa" w:w="80"/>
+              <w:right w:type="dxa" w:w="120"/>
+            </w:tcMar>
+          </w:tcPr>
+          <w:p>
+            <w:pPr>
+              <w:jc w:val="left"/>
+            </w:pPr>
+            <w:r>
+              <w:rPr>
+                <w:rFonts w:ascii="Calibri" w:cs="Calibri" w:eastAsia="Calibri" w:hAnsi="Calibri"/>
+                <w:sz w:val="20"/>
+                <w:szCs w:val="20"/>
+              </w:rPr>
+              <w:t xml:space="preserve">Large</w:t>
             </w:r>
           </w:p>
         </w:tc>
       </w:tr>
     </w:tbl>
+    <w:p>
+      <w:pPr>
+        <w:pStyle w:val="Heading1"/>
+        <w:spacing w:before="360"/>
+      </w:pPr>
+      <w:r>
+        <w:rPr>
+          <w:rFonts w:ascii="Calibri" w:cs="Calibri" w:eastAsia="Calibri" w:hAnsi="Calibri"/>
+        </w:rPr>
+        <w:t xml:space="preserve">Already shipped</w:t>
+      </w:r>
+    </w:p>
+    <w:p>
+      <w:pPr>
+        <w:spacing w:after="120"/>
+      </w:pPr>
+      <w:r>
+        <w:rPr>
+          <w:rFonts w:ascii="Calibri" w:cs="Calibri" w:eastAsia="Calibri" w:hAnsi="Calibri"/>
+          <w:sz w:val="22"/>
+          <w:szCs w:val="22"/>
+        </w:rPr>
+        <w:t xml:space="preserve">Done between 8 and 9 October 2026 and removed from the feature list:</w:t>
+      </w:r>
+    </w:p>
+    <w:p>
+      <w:pPr>
+        <w:pStyle w:val="ListParagraph"/>
+        <w:numPr>
+          <w:ilvl w:val="0"/>
+          <w:numId w:val="2"/>
+        </w:numPr>
+        <w:spacing w:after="80"/>
+      </w:pPr>
+      <w:r>
+        <w:rPr>
+          <w:rFonts w:ascii="Calibri" w:cs="Calibri" w:eastAsia="Calibri" w:hAnsi="Calibri"/>
+          <w:b/>
+          <w:bCs/>
+          <w:sz w:val="22"/>
+          <w:szCs w:val="22"/>
+        </w:rPr>
+        <w:t xml:space="preserve">Business managers</w:t>
+      </w:r>
+      <w:r>
+        <w:rPr>
+          <w:rFonts w:ascii="Calibri" w:cs="Calibri" w:eastAsia="Calibri" w:hAnsi="Calibri"/>
+          <w:sz w:val="22"/>
+          <w:szCs w:val="22"/>
+        </w:rPr>
+        <w:t xml:space="preserve"> — 4-hour shifts, random manager names, offline income per shift.</w:t>
+      </w:r>
+    </w:p>
+    <w:p>
+      <w:pPr>
+        <w:pStyle w:val="ListParagraph"/>
+        <w:numPr>
+          <w:ilvl w:val="0"/>
+          <w:numId w:val="2"/>
+        </w:numPr>
+        <w:spacing w:after="80"/>
+      </w:pPr>
+      <w:r>
+        <w:rPr>
+          <w:rFonts w:ascii="Calibri" w:cs="Calibri" w:eastAsia="Calibri" w:hAnsi="Calibri"/>
+          <w:b/>
+          <w:bCs/>
+          <w:sz w:val="22"/>
+          <w:szCs w:val="22"/>
+        </w:rPr>
+        <w:t xml:space="preserve">Business levels</w:t>
+      </w:r>
+      <w:r>
+        <w:rPr>
+          <w:rFonts w:ascii="Calibri" w:cs="Calibri" w:eastAsia="Calibri" w:hAnsi="Calibri"/>
+          <w:sz w:val="22"/>
+          <w:szCs w:val="22"/>
+        </w:rPr>
+        <w:t xml:space="preserve"> — up to level 100, income doubles at levels 10, 25 and 50.</w:t>
+      </w:r>
+    </w:p>
+    <w:p>
+      <w:pPr>
+        <w:pStyle w:val="ListParagraph"/>
+        <w:numPr>
+          <w:ilvl w:val="0"/>
+          <w:numId w:val="2"/>
+        </w:numPr>
+        <w:spacing w:after="80"/>
+      </w:pPr>
+      <w:r>
+        <w:rPr>
+          <w:rFonts w:ascii="Calibri" w:cs="Calibri" w:eastAsia="Calibri" w:hAnsi="Calibri"/>
+          <w:b/>
+          <w:bCs/>
+          <w:sz w:val="22"/>
+          <w:szCs w:val="22"/>
+        </w:rPr>
+        <w:t xml:space="preserve">Achievements</w:t>
+      </w:r>
+      <w:r>
+        <w:rPr>
+          <w:rFonts w:ascii="Calibri" w:cs="Calibri" w:eastAsia="Calibri" w:hAnsi="Calibri"/>
+          <w:sz w:val="22"/>
+          <w:szCs w:val="22"/>
+        </w:rPr>
+        <w:t xml:space="preserve"> — 18 goals with progress bars on the profile and a toast when one unlocks.</w:t>
+      </w:r>
+    </w:p>
+    <w:p>
+      <w:pPr>
+        <w:pStyle w:val="ListParagraph"/>
+        <w:numPr>
+          <w:ilvl w:val="0"/>
+          <w:numId w:val="2"/>
+        </w:numPr>
+        <w:spacing w:after="80"/>
+      </w:pPr>
+      <w:r>
+        <w:rPr>
+          <w:rFonts w:ascii="Calibri" w:cs="Calibri" w:eastAsia="Calibri" w:hAnsi="Calibri"/>
+          <w:b/>
+          <w:bCs/>
+          <w:sz w:val="22"/>
+          <w:szCs w:val="22"/>
+        </w:rPr>
+        <w:t xml:space="preserve">Admin panel</w:t>
+      </w:r>
+      <w:r>
+        <w:rPr>
+          <w:rFonts w:ascii="Calibri" w:cs="Calibri" w:eastAsia="Calibri" w:hAnsi="Calibri"/>
+          <w:sz w:val="22"/>
+          <w:szCs w:val="22"/>
+        </w:rPr>
+        <w:t xml:space="preserve"> — catalogue editor, player management, manager names, game statistics.</w:t>
+      </w:r>
+    </w:p>
+    <w:p>
+      <w:pPr>
+        <w:pStyle w:val="ListParagraph"/>
+        <w:numPr>
+          <w:ilvl w:val="0"/>
+          <w:numId w:val="2"/>
+        </w:numPr>
+        <w:spacing w:after="80"/>
+      </w:pPr>
+      <w:r>
+        <w:rPr>
+          <w:rFonts w:ascii="Calibri" w:cs="Calibri" w:eastAsia="Calibri" w:hAnsi="Calibri"/>
+          <w:b/>
+          <w:bCs/>
+          <w:sz w:val="22"/>
+          <w:szCs w:val="22"/>
+        </w:rPr>
+        <w:t xml:space="preserve">Luxury collection</w:t>
+      </w:r>
+      <w:r>
+        <w:rPr>
+          <w:rFonts w:ascii="Calibri" w:cs="Calibri" w:eastAsia="Calibri" w:hAnsi="Calibri"/>
+          <w:sz w:val="22"/>
+          <w:szCs w:val="22"/>
+        </w:rPr>
+        <w:t xml:space="preserve"> — 76 items in 16 categories, counted in net worth and shown on the profile.</w:t>
+      </w:r>
+    </w:p>
+    <w:p>
+      <w:pPr>
+        <w:pStyle w:val="ListParagraph"/>
+        <w:numPr>
+          <w:ilvl w:val="0"/>
+          <w:numId w:val="2"/>
+        </w:numPr>
+        <w:spacing w:after="80"/>
+      </w:pPr>
+      <w:r>
+        <w:rPr>
+          <w:rFonts w:ascii="Calibri" w:cs="Calibri" w:eastAsia="Calibri" w:hAnsi="Calibri"/>
+          <w:b/>
+          <w:bCs/>
+          <w:sz w:val="22"/>
+          <w:szCs w:val="22"/>
+        </w:rPr>
+        <w:t xml:space="preserve">Player profile</w:t>
+      </w:r>
+      <w:r>
+        <w:rPr>
+          <w:rFonts w:ascii="Calibri" w:cs="Calibri" w:eastAsia="Calibri" w:hAnsi="Calibri"/>
+          <w:sz w:val="22"/>
+          <w:szCs w:val="22"/>
+        </w:rPr>
+        <w:t xml:space="preserve"> — company, rank, stats, luxury collection and achievements.</w:t>
+      </w:r>
+    </w:p>
+    <w:p>
+      <w:pPr>
+        <w:pStyle w:val="ListParagraph"/>
+        <w:numPr>
+          <w:ilvl w:val="0"/>
+          <w:numId w:val="2"/>
+        </w:numPr>
+        <w:spacing w:after="80"/>
+      </w:pPr>
+      <w:r>
+        <w:rPr>
+          <w:rFonts w:ascii="Calibri" w:cs="Calibri" w:eastAsia="Calibri" w:hAnsi="Calibri"/>
+          <w:b/>
+          <w:bCs/>
+          <w:sz w:val="22"/>
+          <w:szCs w:val="22"/>
+        </w:rPr>
+        <w:t xml:space="preserve">French and Arabic</w:t>
+      </w:r>
+      <w:r>
+        <w:rPr>
+          <w:rFonts w:ascii="Calibri" w:cs="Calibri" w:eastAsia="Calibri" w:hAnsi="Calibri"/>
+          <w:sz w:val="22"/>
+          <w:szCs w:val="22"/>
+        </w:rPr>
+        <w:t xml:space="preserve"> — the whole interface, switchable at any time, right-to-left layout for Arabic.</w:t>
+      </w:r>
+    </w:p>
+    <w:p>
+      <w:pPr>
+        <w:pStyle w:val="ListParagraph"/>
+        <w:numPr>
+          <w:ilvl w:val="0"/>
+          <w:numId w:val="2"/>
+        </w:numPr>
+        <w:spacing w:after="80"/>
+      </w:pPr>
+      <w:r>
+        <w:rPr>
+          <w:rFonts w:ascii="Calibri" w:cs="Calibri" w:eastAsia="Calibri" w:hAnsi="Calibri"/>
+          <w:b/>
+          <w:bCs/>
+          <w:sz w:val="22"/>
+          <w:szCs w:val="22"/>
+        </w:rPr>
+        <w:t xml:space="preserve">Online hosting</w:t>
+      </w:r>
+      <w:r>
+        <w:rPr>
+          <w:rFonts w:ascii="Calibri" w:cs="Calibri" w:eastAsia="Calibri" w:hAnsi="Calibri"/>
+          <w:sz w:val="22"/>
+          <w:szCs w:val="22"/>
+        </w:rPr>
+        <w:t xml:space="preserve"> — Netlify (game), Render (API) and Neon (database), redeployed on every push.</w:t>
+      </w:r>
+    </w:p>
     <w:p>
       <w:pPr>
         <w:pStyle w:val="Heading1"/>
@@ -3421,7 +3825,7 @@
           <w:rFonts w:ascii="Calibri" w:cs="Calibri" w:eastAsia="Calibri" w:hAnsi="Calibri"/>
           <w:color w:val="4F46E5"/>
         </w:rPr>
-        <w:t xml:space="preserve">Feature 1 — Business automation (managers)</w:t>
+        <w:t xml:space="preserve">Feature 1 — Upgrade base income ("side hustles")</w:t>
       </w:r>
     </w:p>
     <w:p>
@@ -3456,7 +3860,7 @@
           <w:sz w:val="20"/>
           <w:szCs w:val="20"/>
         </w:rPr>
-        <w:t xml:space="preserve">  ·  Effort: Medium (1–2 weeks)</w:t>
+        <w:t xml:space="preserve">  ·  Effort: Small (days)</w:t>
       </w:r>
     </w:p>
     <w:p>
@@ -3479,7 +3883,7 @@
           <w:sz w:val="22"/>
           <w:szCs w:val="22"/>
         </w:rPr>
-        <w:t xml:space="preserve">Offline income ("welcome back") only counts automated businesses, but nothing in the game lets a player automate one — so today offline income is just the base $3/s. This is the single biggest missing loop of an idle game.</w:t>
+        <w:t xml:space="preserve">Base income is stuck at $3/s × multiplier. A cheap, always-available upgrade gives new players something to buy in the first minutes.</w:t>
       </w:r>
     </w:p>
     <w:p>
@@ -3513,7 +3917,7 @@
           <w:sz w:val="22"/>
           <w:szCs w:val="22"/>
         </w:rPr>
-        <w:t xml:space="preserve">Hire a manager for an owned business to automate it.</w:t>
+        <w:t xml:space="preserve">A ladder of upgrades: $3 → $7 → $15 → $35 → $80 → $200 per second.</w:t>
       </w:r>
     </w:p>
     <w:p>
@@ -3531,25 +3935,7 @@
           <w:sz w:val="22"/>
           <w:szCs w:val="22"/>
         </w:rPr>
-        <w:t xml:space="preserve">Automated businesses keep earning while the player is away (up to the 4-hour cap).</w:t>
-      </w:r>
-    </w:p>
-    <w:p>
-      <w:pPr>
-        <w:pStyle w:val="ListParagraph"/>
-        <w:numPr>
-          <w:ilvl w:val="0"/>
-          <w:numId w:val="2"/>
-        </w:numPr>
-        <w:spacing w:after="60"/>
-      </w:pPr>
-      <w:r>
-        <w:rPr>
-          <w:rFonts w:ascii="Calibri" w:cs="Calibri" w:eastAsia="Calibri" w:hAnsi="Calibri"/>
-          <w:sz w:val="22"/>
-          <w:szCs w:val="22"/>
-        </w:rPr>
-        <w:t xml:space="preserve">Manager price scales with the business: e.g. 2× its opening cost.</w:t>
+        <w:t xml:space="preserve">Each step costs cash and is shown on the dashboard.</w:t>
       </w:r>
     </w:p>
     <w:p>
@@ -3583,7 +3969,7 @@
           <w:sz w:val="22"/>
           <w:szCs w:val="22"/>
         </w:rPr>
-        <w:t xml:space="preserve">Backend: Business.Automate() and IsAutomated already exist. Add an automation price to the catalogue (a column, editable by admins), a Company.AutomateBusiness rule and POST /api/game/businesses/{id}/automate.</w:t>
+        <w:t xml:space="preserve">Backend: Company.UpgradePassiveIncome is implemented and tested but not exposed. The tiers must first be redefined so they compose with prestige (see the open item in RichLife/CLAUDE.md). Then expose POST /api/game/upgrade-income.</w:t>
       </w:r>
     </w:p>
     <w:p>
@@ -3601,25 +3987,7 @@
           <w:sz w:val="22"/>
           <w:szCs w:val="22"/>
         </w:rPr>
-        <w:t xml:space="preserve">Frontend: "Hire manager" button in the manage-business dialog; the existing ⚡ Auto badge then lights up.</w:t>
-      </w:r>
-    </w:p>
-    <w:p>
-      <w:pPr>
-        <w:pStyle w:val="ListParagraph"/>
-        <w:numPr>
-          <w:ilvl w:val="0"/>
-          <w:numId w:val="2"/>
-        </w:numPr>
-        <w:spacing w:after="60"/>
-      </w:pPr>
-      <w:r>
-        <w:rPr>
-          <w:rFonts w:ascii="Calibri" w:cs="Calibri" w:eastAsia="Calibri" w:hAnsi="Calibri"/>
-          <w:sz w:val="22"/>
-          <w:szCs w:val="22"/>
-        </w:rPr>
-        <w:t xml:space="preserve">Contract first: new route + catalogue field.</w:t>
+        <w:t xml:space="preserve">Frontend: an "Upgrade income" card on the dashboard, with its texts in English, French and Arabic.</w:t>
       </w:r>
     </w:p>
     <w:p>
@@ -3642,7 +4010,7 @@
           <w:sz w:val="22"/>
           <w:szCs w:val="22"/>
         </w:rPr>
-        <w:t xml:space="preserve">None</w:t>
+        <w:t xml:space="preserve">Fix of the double prestige multiplier (see "Fix first")</w:t>
       </w:r>
     </w:p>
     <w:p>
@@ -3656,7 +4024,7 @@
           <w:rFonts w:ascii="Calibri" w:cs="Calibri" w:eastAsia="Calibri" w:hAnsi="Calibri"/>
           <w:color w:val="4F46E5"/>
         </w:rPr>
-        <w:t xml:space="preserve">Feature 2 — Upgrade base income ("side hustles")</w:t>
+        <w:t xml:space="preserve">Feature 2 — Daily login rewards and streaks</w:t>
       </w:r>
     </w:p>
     <w:p>
@@ -3671,7 +4039,7 @@
           <w:sz w:val="20"/>
           <w:szCs w:val="20"/>
         </w:rPr>
-        <w:t xml:space="preserve">Core gameplay  ·  </w:t>
+        <w:t xml:space="preserve">Engagement  ·  </w:t>
       </w:r>
       <w:r>
         <w:rPr>
@@ -3714,7 +4082,7 @@
           <w:sz w:val="22"/>
           <w:szCs w:val="22"/>
         </w:rPr>
-        <w:t xml:space="preserve">Base income is stuck at $3/s × multiplier. A cheap, always-available upgrade gives new players something to buy in the first minutes.</w:t>
+        <w:t xml:space="preserve">Gives players a reason to open the app every day, the main retention lever for idle games.</w:t>
       </w:r>
     </w:p>
     <w:p>
@@ -3748,7 +4116,7 @@
           <w:sz w:val="22"/>
           <w:szCs w:val="22"/>
         </w:rPr>
-        <w:t xml:space="preserve">A ladder of upgrades: $3 → $7 → $15 → $35 → $80 → $200 per second.</w:t>
+        <w:t xml:space="preserve">A reward on the first visit of each day; it grows with consecutive days (day 1 → day 7).</w:t>
       </w:r>
     </w:p>
     <w:p>
@@ -3766,7 +4134,7 @@
           <w:sz w:val="22"/>
           <w:szCs w:val="22"/>
         </w:rPr>
-        <w:t xml:space="preserve">Each step costs cash and is shown on the dashboard.</w:t>
+        <w:t xml:space="preserve">Missing a day resets the streak.</w:t>
       </w:r>
     </w:p>
     <w:p>
@@ -3800,7 +4168,7 @@
           <w:sz w:val="22"/>
           <w:szCs w:val="22"/>
         </w:rPr>
-        <w:t xml:space="preserve">Backend: Company.UpgradePassiveIncome is implemented and tested but not exposed. The tiers must first be redefined so they compose with prestige (see the open item in RichLife/CLAUDE.md). Then expose POST /api/game/upgrade-income.</w:t>
+        <w:t xml:space="preserve">Backend: LastDailyClaim and Streak on Company; GET/POST /api/game/daily-reward. Reward = minutes of the player's income, so it scales with progress.</w:t>
       </w:r>
     </w:p>
     <w:p>
@@ -3818,7 +4186,7 @@
           <w:sz w:val="22"/>
           <w:szCs w:val="22"/>
         </w:rPr>
-        <w:t xml:space="preserve">Frontend: an "Upgrade income" card on the dashboard.</w:t>
+        <w:t xml:space="preserve">Frontend: a dialog after the welcome-back one, with the 7-day calendar.</w:t>
       </w:r>
     </w:p>
     <w:p>
@@ -3841,7 +4209,7 @@
           <w:sz w:val="22"/>
           <w:szCs w:val="22"/>
         </w:rPr>
-        <w:t xml:space="preserve">Fix of the double prestige multiplier (see "Fix first")</w:t>
+        <w:t xml:space="preserve">None</w:t>
       </w:r>
     </w:p>
     <w:p>
@@ -3855,7 +4223,7 @@
           <w:rFonts w:ascii="Calibri" w:cs="Calibri" w:eastAsia="Calibri" w:hAnsi="Calibri"/>
           <w:color w:val="4F46E5"/>
         </w:rPr>
-        <w:t xml:space="preserve">Feature 3 — Business levels</w:t>
+        <w:t xml:space="preserve">Feature 3 — Installable mobile app (PWA) and notifications</w:t>
       </w:r>
     </w:p>
     <w:p>
@@ -3870,7 +4238,651 @@
           <w:sz w:val="20"/>
           <w:szCs w:val="20"/>
         </w:rPr>
-        <w:t xml:space="preserve">Core gameplay  ·  </w:t>
+        <w:t xml:space="preserve">Platform  ·  </w:t>
+      </w:r>
+      <w:r>
+        <w:rPr>
+          <w:rFonts w:ascii="Calibri" w:cs="Calibri" w:eastAsia="Calibri" w:hAnsi="Calibri"/>
+          <w:b/>
+          <w:bCs/>
+          <w:color w:val="B91C1C"/>
+          <w:sz w:val="20"/>
+          <w:szCs w:val="20"/>
+        </w:rPr>
+        <w:t xml:space="preserve">Priority: High</w:t>
+      </w:r>
+      <w:r>
+        <w:rPr>
+          <w:rFonts w:ascii="Calibri" w:cs="Calibri" w:eastAsia="Calibri" w:hAnsi="Calibri"/>
+          <w:color w:val="64748B"/>
+          <w:sz w:val="20"/>
+          <w:szCs w:val="20"/>
+        </w:rPr>
+        <w:t xml:space="preserve">  ·  Effort: Small (days)</w:t>
+      </w:r>
+    </w:p>
+    <w:p>
+      <w:pPr>
+        <w:spacing w:after="80"/>
+      </w:pPr>
+      <w:r>
+        <w:rPr>
+          <w:rFonts w:ascii="Calibri" w:cs="Calibri" w:eastAsia="Calibri" w:hAnsi="Calibri"/>
+          <w:b/>
+          <w:bCs/>
+          <w:sz w:val="22"/>
+          <w:szCs w:val="22"/>
+        </w:rPr>
+        <w:t xml:space="preserve">Why: </w:t>
+      </w:r>
+      <w:r>
+        <w:rPr>
+          <w:rFonts w:ascii="Calibri" w:cs="Calibri" w:eastAsia="Calibri" w:hAnsi="Calibri"/>
+          <w:sz w:val="22"/>
+          <w:szCs w:val="22"/>
+        </w:rPr>
+        <w:t xml:space="preserve">Most idle-game time is on phones. An installable app with an icon feels like a real game and can remind players to come back.</w:t>
+      </w:r>
+    </w:p>
+    <w:p>
+      <w:pPr>
+        <w:keepNext/>
+        <w:spacing w:after="60" w:before="80"/>
+      </w:pPr>
+      <w:r>
+        <w:rPr>
+          <w:rFonts w:ascii="Calibri" w:cs="Calibri" w:eastAsia="Calibri" w:hAnsi="Calibri"/>
+          <w:b/>
+          <w:bCs/>
+          <w:sz w:val="22"/>
+          <w:szCs w:val="22"/>
+        </w:rPr>
+        <w:t xml:space="preserve">What it does</w:t>
+      </w:r>
+    </w:p>
+    <w:p>
+      <w:pPr>
+        <w:pStyle w:val="ListParagraph"/>
+        <w:numPr>
+          <w:ilvl w:val="0"/>
+          <w:numId w:val="2"/>
+        </w:numPr>
+        <w:spacing w:after="60"/>
+      </w:pPr>
+      <w:r>
+        <w:rPr>
+          <w:rFonts w:ascii="Calibri" w:cs="Calibri" w:eastAsia="Calibri" w:hAnsi="Calibri"/>
+          <w:sz w:val="22"/>
+          <w:szCs w:val="22"/>
+        </w:rPr>
+        <w:t xml:space="preserve">"Add to home screen", full-screen launch, app icon and splash.</w:t>
+      </w:r>
+    </w:p>
+    <w:p>
+      <w:pPr>
+        <w:pStyle w:val="ListParagraph"/>
+        <w:numPr>
+          <w:ilvl w:val="0"/>
+          <w:numId w:val="2"/>
+        </w:numPr>
+        <w:spacing w:after="60"/>
+      </w:pPr>
+      <w:r>
+        <w:rPr>
+          <w:rFonts w:ascii="Calibri" w:cs="Calibri" w:eastAsia="Calibri" w:hAnsi="Calibri"/>
+          <w:sz w:val="22"/>
+          <w:szCs w:val="22"/>
+        </w:rPr>
+        <w:t xml:space="preserve">Optional push notification: "Your businesses hit the 4-hour offline cap — collect now", or "Your manager's shift has ended".</w:t>
+      </w:r>
+    </w:p>
+    <w:p>
+      <w:pPr>
+        <w:keepNext/>
+        <w:spacing w:after="60" w:before="80"/>
+      </w:pPr>
+      <w:r>
+        <w:rPr>
+          <w:rFonts w:ascii="Calibri" w:cs="Calibri" w:eastAsia="Calibri" w:hAnsi="Calibri"/>
+          <w:b/>
+          <w:bCs/>
+          <w:sz w:val="22"/>
+          <w:szCs w:val="22"/>
+        </w:rPr>
+        <w:t xml:space="preserve">How</w:t>
+      </w:r>
+    </w:p>
+    <w:p>
+      <w:pPr>
+        <w:pStyle w:val="ListParagraph"/>
+        <w:numPr>
+          <w:ilvl w:val="0"/>
+          <w:numId w:val="2"/>
+        </w:numPr>
+        <w:spacing w:after="60"/>
+      </w:pPr>
+      <w:r>
+        <w:rPr>
+          <w:rFonts w:ascii="Calibri" w:cs="Calibri" w:eastAsia="Calibri" w:hAnsi="Calibri"/>
+          <w:sz w:val="22"/>
+          <w:szCs w:val="22"/>
+        </w:rPr>
+        <w:t xml:space="preserve">Frontend: Angular service worker + web manifest (ng add @angular/pwa).</w:t>
+      </w:r>
+    </w:p>
+    <w:p>
+      <w:pPr>
+        <w:pStyle w:val="ListParagraph"/>
+        <w:numPr>
+          <w:ilvl w:val="0"/>
+          <w:numId w:val="2"/>
+        </w:numPr>
+        <w:spacing w:after="60"/>
+      </w:pPr>
+      <w:r>
+        <w:rPr>
+          <w:rFonts w:ascii="Calibri" w:cs="Calibri" w:eastAsia="Calibri" w:hAnsi="Calibri"/>
+          <w:sz w:val="22"/>
+          <w:szCs w:val="22"/>
+        </w:rPr>
+        <w:t xml:space="preserve">Backend (push only): store push subscriptions; a background job sends the reminder.</w:t>
+      </w:r>
+    </w:p>
+    <w:p>
+      <w:pPr>
+        <w:spacing w:after="80"/>
+      </w:pPr>
+      <w:r>
+        <w:rPr>
+          <w:rFonts w:ascii="Calibri" w:cs="Calibri" w:eastAsia="Calibri" w:hAnsi="Calibri"/>
+          <w:b/>
+          <w:bCs/>
+          <w:sz w:val="22"/>
+          <w:szCs w:val="22"/>
+        </w:rPr>
+        <w:t xml:space="preserve">Depends on: </w:t>
+      </w:r>
+      <w:r>
+        <w:rPr>
+          <w:rFonts w:ascii="Calibri" w:cs="Calibri" w:eastAsia="Calibri" w:hAnsi="Calibri"/>
+          <w:sz w:val="22"/>
+          <w:szCs w:val="22"/>
+        </w:rPr>
+        <w:t xml:space="preserve">HTTPS hosting — already provided by Netlify</w:t>
+      </w:r>
+    </w:p>
+    <w:p>
+      <w:pPr>
+        <w:pStyle w:val="Heading2"/>
+        <w:keepNext/>
+        <w:spacing w:after="120" w:before="320"/>
+      </w:pPr>
+      <w:r>
+        <w:rPr>
+          <w:rFonts w:ascii="Calibri" w:cs="Calibri" w:eastAsia="Calibri" w:hAnsi="Calibri"/>
+          <w:color w:val="4F46E5"/>
+        </w:rPr>
+        <w:t xml:space="preserve">Feature 4 — Account security</w:t>
+      </w:r>
+    </w:p>
+    <w:p>
+      <w:pPr>
+        <w:keepNext/>
+        <w:spacing w:after="120"/>
+      </w:pPr>
+      <w:r>
+        <w:rPr>
+          <w:rFonts w:ascii="Calibri" w:cs="Calibri" w:eastAsia="Calibri" w:hAnsi="Calibri"/>
+          <w:color w:val="64748B"/>
+          <w:sz w:val="20"/>
+          <w:szCs w:val="20"/>
+        </w:rPr>
+        <w:t xml:space="preserve">Platform  ·  </w:t>
+      </w:r>
+      <w:r>
+        <w:rPr>
+          <w:rFonts w:ascii="Calibri" w:cs="Calibri" w:eastAsia="Calibri" w:hAnsi="Calibri"/>
+          <w:b/>
+          <w:bCs/>
+          <w:color w:val="B91C1C"/>
+          <w:sz w:val="20"/>
+          <w:szCs w:val="20"/>
+        </w:rPr>
+        <w:t xml:space="preserve">Priority: High</w:t>
+      </w:r>
+      <w:r>
+        <w:rPr>
+          <w:rFonts w:ascii="Calibri" w:cs="Calibri" w:eastAsia="Calibri" w:hAnsi="Calibri"/>
+          <w:color w:val="64748B"/>
+          <w:sz w:val="20"/>
+          <w:szCs w:val="20"/>
+        </w:rPr>
+        <w:t xml:space="preserve">  ·  Effort: Medium (1–2 weeks)</w:t>
+      </w:r>
+    </w:p>
+    <w:p>
+      <w:pPr>
+        <w:spacing w:after="80"/>
+      </w:pPr>
+      <w:r>
+        <w:rPr>
+          <w:rFonts w:ascii="Calibri" w:cs="Calibri" w:eastAsia="Calibri" w:hAnsi="Calibri"/>
+          <w:b/>
+          <w:bCs/>
+          <w:sz w:val="22"/>
+          <w:szCs w:val="22"/>
+        </w:rPr>
+        <w:t xml:space="preserve">Why: </w:t>
+      </w:r>
+      <w:r>
+        <w:rPr>
+          <w:rFonts w:ascii="Calibri" w:cs="Calibri" w:eastAsia="Calibri" w:hAnsi="Calibri"/>
+          <w:sz w:val="22"/>
+          <w:szCs w:val="22"/>
+        </w:rPr>
+        <w:t xml:space="preserve">Required now that the game is online and real players can sign up.</w:t>
+      </w:r>
+    </w:p>
+    <w:p>
+      <w:pPr>
+        <w:keepNext/>
+        <w:spacing w:after="60" w:before="80"/>
+      </w:pPr>
+      <w:r>
+        <w:rPr>
+          <w:rFonts w:ascii="Calibri" w:cs="Calibri" w:eastAsia="Calibri" w:hAnsi="Calibri"/>
+          <w:b/>
+          <w:bCs/>
+          <w:sz w:val="22"/>
+          <w:szCs w:val="22"/>
+        </w:rPr>
+        <w:t xml:space="preserve">What it does</w:t>
+      </w:r>
+    </w:p>
+    <w:p>
+      <w:pPr>
+        <w:pStyle w:val="ListParagraph"/>
+        <w:numPr>
+          <w:ilvl w:val="0"/>
+          <w:numId w:val="2"/>
+        </w:numPr>
+        <w:spacing w:after="60"/>
+      </w:pPr>
+      <w:r>
+        <w:rPr>
+          <w:rFonts w:ascii="Calibri" w:cs="Calibri" w:eastAsia="Calibri" w:hAnsi="Calibri"/>
+          <w:sz w:val="22"/>
+          <w:szCs w:val="22"/>
+        </w:rPr>
+        <w:t xml:space="preserve">Password reset by email, email verification, a minimum password strength.</w:t>
+      </w:r>
+    </w:p>
+    <w:p>
+      <w:pPr>
+        <w:pStyle w:val="ListParagraph"/>
+        <w:numPr>
+          <w:ilvl w:val="0"/>
+          <w:numId w:val="2"/>
+        </w:numPr>
+        <w:spacing w:after="60"/>
+      </w:pPr>
+      <w:r>
+        <w:rPr>
+          <w:rFonts w:ascii="Calibri" w:cs="Calibri" w:eastAsia="Calibri" w:hAnsi="Calibri"/>
+          <w:sz w:val="22"/>
+          <w:szCs w:val="22"/>
+        </w:rPr>
+        <w:t xml:space="preserve">Server-side validation on registration (today a blank username crashes with a 500 error — see contract "Known gaps").</w:t>
+      </w:r>
+    </w:p>
+    <w:p>
+      <w:pPr>
+        <w:keepNext/>
+        <w:spacing w:after="60" w:before="80"/>
+      </w:pPr>
+      <w:r>
+        <w:rPr>
+          <w:rFonts w:ascii="Calibri" w:cs="Calibri" w:eastAsia="Calibri" w:hAnsi="Calibri"/>
+          <w:b/>
+          <w:bCs/>
+          <w:sz w:val="22"/>
+          <w:szCs w:val="22"/>
+        </w:rPr>
+        <w:t xml:space="preserve">How</w:t>
+      </w:r>
+    </w:p>
+    <w:p>
+      <w:pPr>
+        <w:pStyle w:val="ListParagraph"/>
+        <w:numPr>
+          <w:ilvl w:val="0"/>
+          <w:numId w:val="2"/>
+        </w:numPr>
+        <w:spacing w:after="60"/>
+      </w:pPr>
+      <w:r>
+        <w:rPr>
+          <w:rFonts w:ascii="Calibri" w:cs="Calibri" w:eastAsia="Calibri" w:hAnsi="Calibri"/>
+          <w:sz w:val="22"/>
+          <w:szCs w:val="22"/>
+        </w:rPr>
+        <w:t xml:space="preserve">Backend: validation in AuthService, an email sender, reset tokens.</w:t>
+      </w:r>
+    </w:p>
+    <w:p>
+      <w:pPr>
+        <w:pStyle w:val="ListParagraph"/>
+        <w:numPr>
+          <w:ilvl w:val="0"/>
+          <w:numId w:val="2"/>
+        </w:numPr>
+        <w:spacing w:after="60"/>
+      </w:pPr>
+      <w:r>
+        <w:rPr>
+          <w:rFonts w:ascii="Calibri" w:cs="Calibri" w:eastAsia="Calibri" w:hAnsi="Calibri"/>
+          <w:sz w:val="22"/>
+          <w:szCs w:val="22"/>
+        </w:rPr>
+        <w:t xml:space="preserve">Frontend: "Forgot password?" flow and inline validation messages (in all three languages).</w:t>
+      </w:r>
+    </w:p>
+    <w:p>
+      <w:pPr>
+        <w:spacing w:after="80"/>
+      </w:pPr>
+      <w:r>
+        <w:rPr>
+          <w:rFonts w:ascii="Calibri" w:cs="Calibri" w:eastAsia="Calibri" w:hAnsi="Calibri"/>
+          <w:b/>
+          <w:bCs/>
+          <w:sz w:val="22"/>
+          <w:szCs w:val="22"/>
+        </w:rPr>
+        <w:t xml:space="preserve">Depends on: </w:t>
+      </w:r>
+      <w:r>
+        <w:rPr>
+          <w:rFonts w:ascii="Calibri" w:cs="Calibri" w:eastAsia="Calibri" w:hAnsi="Calibri"/>
+          <w:sz w:val="22"/>
+          <w:szCs w:val="22"/>
+        </w:rPr>
+        <w:t xml:space="preserve">An email provider</w:t>
+      </w:r>
+    </w:p>
+    <w:p>
+      <w:pPr>
+        <w:pStyle w:val="Heading2"/>
+        <w:keepNext/>
+        <w:spacing w:after="120" w:before="320"/>
+      </w:pPr>
+      <w:r>
+        <w:rPr>
+          <w:rFonts w:ascii="Calibri" w:cs="Calibri" w:eastAsia="Calibri" w:hAnsi="Calibri"/>
+          <w:color w:val="4F46E5"/>
+        </w:rPr>
+        <w:t xml:space="preserve">Feature 5 — Production reliability</w:t>
+      </w:r>
+    </w:p>
+    <w:p>
+      <w:pPr>
+        <w:keepNext/>
+        <w:spacing w:after="120"/>
+      </w:pPr>
+      <w:r>
+        <w:rPr>
+          <w:rFonts w:ascii="Calibri" w:cs="Calibri" w:eastAsia="Calibri" w:hAnsi="Calibri"/>
+          <w:color w:val="64748B"/>
+          <w:sz w:val="20"/>
+          <w:szCs w:val="20"/>
+        </w:rPr>
+        <w:t xml:space="preserve">Platform  ·  </w:t>
+      </w:r>
+      <w:r>
+        <w:rPr>
+          <w:rFonts w:ascii="Calibri" w:cs="Calibri" w:eastAsia="Calibri" w:hAnsi="Calibri"/>
+          <w:b/>
+          <w:bCs/>
+          <w:color w:val="B91C1C"/>
+          <w:sz w:val="20"/>
+          <w:szCs w:val="20"/>
+        </w:rPr>
+        <w:t xml:space="preserve">Priority: High</w:t>
+      </w:r>
+      <w:r>
+        <w:rPr>
+          <w:rFonts w:ascii="Calibri" w:cs="Calibri" w:eastAsia="Calibri" w:hAnsi="Calibri"/>
+          <w:color w:val="64748B"/>
+          <w:sz w:val="20"/>
+          <w:szCs w:val="20"/>
+        </w:rPr>
+        <w:t xml:space="preserve">  ·  Effort: Small (days)</w:t>
+      </w:r>
+      <w:r>
+        <w:rPr>
+          <w:rFonts w:ascii="Calibri" w:cs="Calibri" w:eastAsia="Calibri" w:hAnsi="Calibri"/>
+          <w:b/>
+          <w:bCs/>
+          <w:color w:val="4F46E5"/>
+          <w:sz w:val="20"/>
+          <w:szCs w:val="20"/>
+        </w:rPr>
+        <w:t xml:space="preserve">  ·  New</w:t>
+      </w:r>
+    </w:p>
+    <w:p>
+      <w:pPr>
+        <w:spacing w:after="80"/>
+      </w:pPr>
+      <w:r>
+        <w:rPr>
+          <w:rFonts w:ascii="Calibri" w:cs="Calibri" w:eastAsia="Calibri" w:hAnsi="Calibri"/>
+          <w:b/>
+          <w:bCs/>
+          <w:sz w:val="22"/>
+          <w:szCs w:val="22"/>
+        </w:rPr>
+        <w:t xml:space="preserve">Why: </w:t>
+      </w:r>
+      <w:r>
+        <w:rPr>
+          <w:rFonts w:ascii="Calibri" w:cs="Calibri" w:eastAsia="Calibri" w:hAnsi="Calibri"/>
+          <w:sz w:val="22"/>
+          <w:szCs w:val="22"/>
+        </w:rPr>
+        <w:t xml:space="preserve">The game is live on free hosting. The first visit after 15 idle minutes takes 30–60 seconds while Render wakes up, and nobody is told when something breaks.</w:t>
+      </w:r>
+    </w:p>
+    <w:p>
+      <w:pPr>
+        <w:keepNext/>
+        <w:spacing w:after="60" w:before="80"/>
+      </w:pPr>
+      <w:r>
+        <w:rPr>
+          <w:rFonts w:ascii="Calibri" w:cs="Calibri" w:eastAsia="Calibri" w:hAnsi="Calibri"/>
+          <w:b/>
+          <w:bCs/>
+          <w:sz w:val="22"/>
+          <w:szCs w:val="22"/>
+        </w:rPr>
+        <w:t xml:space="preserve">What it does</w:t>
+      </w:r>
+    </w:p>
+    <w:p>
+      <w:pPr>
+        <w:pStyle w:val="ListParagraph"/>
+        <w:numPr>
+          <w:ilvl w:val="0"/>
+          <w:numId w:val="2"/>
+        </w:numPr>
+        <w:spacing w:after="60"/>
+      </w:pPr>
+      <w:r>
+        <w:rPr>
+          <w:rFonts w:ascii="Calibri" w:cs="Calibri" w:eastAsia="Calibri" w:hAnsi="Calibri"/>
+          <w:sz w:val="22"/>
+          <w:szCs w:val="22"/>
+        </w:rPr>
+        <w:t xml:space="preserve">Fast first load: keep the API awake, or move it to a paid instance.</w:t>
+      </w:r>
+    </w:p>
+    <w:p>
+      <w:pPr>
+        <w:pStyle w:val="ListParagraph"/>
+        <w:numPr>
+          <w:ilvl w:val="0"/>
+          <w:numId w:val="2"/>
+        </w:numPr>
+        <w:spacing w:after="60"/>
+      </w:pPr>
+      <w:r>
+        <w:rPr>
+          <w:rFonts w:ascii="Calibri" w:cs="Calibri" w:eastAsia="Calibri" w:hAnsi="Calibri"/>
+          <w:sz w:val="22"/>
+          <w:szCs w:val="22"/>
+        </w:rPr>
+        <w:t xml:space="preserve">Uptime monitoring and an alert when the site or the API is down.</w:t>
+      </w:r>
+    </w:p>
+    <w:p>
+      <w:pPr>
+        <w:pStyle w:val="ListParagraph"/>
+        <w:numPr>
+          <w:ilvl w:val="0"/>
+          <w:numId w:val="2"/>
+        </w:numPr>
+        <w:spacing w:after="60"/>
+      </w:pPr>
+      <w:r>
+        <w:rPr>
+          <w:rFonts w:ascii="Calibri" w:cs="Calibri" w:eastAsia="Calibri" w:hAnsi="Calibri"/>
+          <w:sz w:val="22"/>
+          <w:szCs w:val="22"/>
+        </w:rPr>
+        <w:t xml:space="preserve">Regular database backups, and a tested way to restore one.</w:t>
+      </w:r>
+    </w:p>
+    <w:p>
+      <w:pPr>
+        <w:pStyle w:val="ListParagraph"/>
+        <w:numPr>
+          <w:ilvl w:val="0"/>
+          <w:numId w:val="2"/>
+        </w:numPr>
+        <w:spacing w:after="60"/>
+      </w:pPr>
+      <w:r>
+        <w:rPr>
+          <w:rFonts w:ascii="Calibri" w:cs="Calibri" w:eastAsia="Calibri" w:hAnsi="Calibri"/>
+          <w:sz w:val="22"/>
+          <w:szCs w:val="22"/>
+        </w:rPr>
+        <w:t xml:space="preserve">A clean error message instead of a raw 500 page when the server fails.</w:t>
+      </w:r>
+    </w:p>
+    <w:p>
+      <w:pPr>
+        <w:keepNext/>
+        <w:spacing w:after="60" w:before="80"/>
+      </w:pPr>
+      <w:r>
+        <w:rPr>
+          <w:rFonts w:ascii="Calibri" w:cs="Calibri" w:eastAsia="Calibri" w:hAnsi="Calibri"/>
+          <w:b/>
+          <w:bCs/>
+          <w:sz w:val="22"/>
+          <w:szCs w:val="22"/>
+        </w:rPr>
+        <w:t xml:space="preserve">How</w:t>
+      </w:r>
+    </w:p>
+    <w:p>
+      <w:pPr>
+        <w:pStyle w:val="ListParagraph"/>
+        <w:numPr>
+          <w:ilvl w:val="0"/>
+          <w:numId w:val="2"/>
+        </w:numPr>
+        <w:spacing w:after="60"/>
+      </w:pPr>
+      <w:r>
+        <w:rPr>
+          <w:rFonts w:ascii="Calibri" w:cs="Calibri" w:eastAsia="Calibri" w:hAnsi="Calibri"/>
+          <w:sz w:val="22"/>
+          <w:szCs w:val="22"/>
+        </w:rPr>
+        <w:t xml:space="preserve">Backend: a global exception handler (the contract lists "no global exception handler" as a known gap); structured error logging.</w:t>
+      </w:r>
+    </w:p>
+    <w:p>
+      <w:pPr>
+        <w:pStyle w:val="ListParagraph"/>
+        <w:numPr>
+          <w:ilvl w:val="0"/>
+          <w:numId w:val="2"/>
+        </w:numPr>
+        <w:spacing w:after="60"/>
+      </w:pPr>
+      <w:r>
+        <w:rPr>
+          <w:rFonts w:ascii="Calibri" w:cs="Calibri" w:eastAsia="Calibri" w:hAnsi="Calibri"/>
+          <w:sz w:val="22"/>
+          <w:szCs w:val="22"/>
+        </w:rPr>
+        <w:t xml:space="preserve">Ops: an uptime monitor pinging /health; Neon branch or pg_dump backups on a schedule.</w:t>
+      </w:r>
+    </w:p>
+    <w:p>
+      <w:pPr>
+        <w:spacing w:after="80"/>
+      </w:pPr>
+      <w:r>
+        <w:rPr>
+          <w:rFonts w:ascii="Calibri" w:cs="Calibri" w:eastAsia="Calibri" w:hAnsi="Calibri"/>
+          <w:b/>
+          <w:bCs/>
+          <w:sz w:val="22"/>
+          <w:szCs w:val="22"/>
+        </w:rPr>
+        <w:t xml:space="preserve">Depends on: </w:t>
+      </w:r>
+      <w:r>
+        <w:rPr>
+          <w:rFonts w:ascii="Calibri" w:cs="Calibri" w:eastAsia="Calibri" w:hAnsi="Calibri"/>
+          <w:sz w:val="22"/>
+          <w:szCs w:val="22"/>
+        </w:rPr>
+        <w:t xml:space="preserve">None</w:t>
+      </w:r>
+    </w:p>
+    <w:p>
+      <w:pPr>
+        <w:pStyle w:val="Heading2"/>
+        <w:keepNext/>
+        <w:spacing w:after="120" w:before="320"/>
+      </w:pPr>
+      <w:r>
+        <w:rPr>
+          <w:rFonts w:ascii="Calibri" w:cs="Calibri" w:eastAsia="Calibri" w:hAnsi="Calibri"/>
+          <w:color w:val="4F46E5"/>
+        </w:rPr>
+        <w:t xml:space="preserve">Feature 6 — Achievement rewards</w:t>
+      </w:r>
+    </w:p>
+    <w:p>
+      <w:pPr>
+        <w:keepNext/>
+        <w:spacing w:after="120"/>
+      </w:pPr>
+      <w:r>
+        <w:rPr>
+          <w:rFonts w:ascii="Calibri" w:cs="Calibri" w:eastAsia="Calibri" w:hAnsi="Calibri"/>
+          <w:color w:val="64748B"/>
+          <w:sz w:val="20"/>
+          <w:szCs w:val="20"/>
+        </w:rPr>
+        <w:t xml:space="preserve">Engagement  ·  </w:t>
       </w:r>
       <w:r>
         <w:rPr>
@@ -3890,7 +4902,18 @@
           <w:sz w:val="20"/>
           <w:szCs w:val="20"/>
         </w:rPr>
-        <w:t xml:space="preserve">  ·  Effort: Medium (1–2 weeks)</w:t>
+        <w:t xml:space="preserve">  ·  Effort: Small (days)</w:t>
+      </w:r>
+      <w:r>
+        <w:rPr>
+          <w:rFonts w:ascii="Calibri" w:cs="Calibri" w:eastAsia="Calibri" w:hAnsi="Calibri"/>
+          <w:b/>
+          <w:bCs/>
+          <w:color w:val="4F46E5"/>
+          <w:sz w:val="20"/>
+          <w:szCs w:val="20"/>
+        </w:rPr>
+        <w:t xml:space="preserve">  ·  New</w:t>
       </w:r>
     </w:p>
     <w:p>
@@ -3913,7 +4936,7 @@
           <w:sz w:val="22"/>
           <w:szCs w:val="22"/>
         </w:rPr>
-        <w:t xml:space="preserve">Assets are the only way to grow a business. Levels add a second, classic idle-game progression: pay to level up and multiply income.</w:t>
+        <w:t xml:space="preserve">The 18 achievements on the profile page show progress but give nothing. A reward makes each one worth chasing.</w:t>
       </w:r>
     </w:p>
     <w:p>
@@ -3947,7 +4970,7 @@
           <w:sz w:val="22"/>
           <w:szCs w:val="22"/>
         </w:rPr>
-        <w:t xml:space="preserve">Each business has a level (1, 2, 3 …). Leveling up costs more each time and boosts that business's income by a percentage.</w:t>
+        <w:t xml:space="preserve">A "Claim" button on each unlocked achievement: cash, or a small permanent income bonus for the harder ones.</w:t>
       </w:r>
     </w:p>
     <w:p>
@@ -3965,7 +4988,7 @@
           <w:sz w:val="22"/>
           <w:szCs w:val="22"/>
         </w:rPr>
-        <w:t xml:space="preserve">Milestones (level 10, 25, 50) double income — a strong reason to come back.</w:t>
+        <w:t xml:space="preserve">New achievements for the newest features: buy a luxury item from each category, reach level 50, keep a manager on shift for a week.</w:t>
       </w:r>
     </w:p>
     <w:p>
@@ -3999,7 +5022,7 @@
           <w:sz w:val="22"/>
           <w:szCs w:val="22"/>
         </w:rPr>
-        <w:t xml:space="preserve">Backend: Level on Business, cost/boost formula in GameConstants, POST /api/game/businesses/{id}/level-up.</w:t>
+        <w:t xml:space="preserve">Backend: a reward per achievement in the rules (Achievements.cs), a ClaimedAt column, POST /api/profile/achievements/{code}/claim.</w:t>
       </w:r>
     </w:p>
     <w:p>
@@ -4017,7 +5040,7 @@
           <w:sz w:val="22"/>
           <w:szCs w:val="22"/>
         </w:rPr>
-        <w:t xml:space="preserve">Frontend: level badge + "Level up" button on each business card.</w:t>
+        <w:t xml:space="preserve">Frontend: claim button and a reward toast on the profile page.</w:t>
       </w:r>
     </w:p>
     <w:p>
@@ -4054,7 +5077,7 @@
           <w:rFonts w:ascii="Calibri" w:cs="Calibri" w:eastAsia="Calibri" w:hAnsi="Calibri"/>
           <w:color w:val="4F46E5"/>
         </w:rPr>
-        <w:t xml:space="preserve">Feature 4 — Daily login rewards and streaks</w:t>
+        <w:t xml:space="preserve">Feature 7 — Public player profiles</w:t>
       </w:r>
     </w:p>
     <w:p>
@@ -4069,18 +5092,18 @@
           <w:sz w:val="20"/>
           <w:szCs w:val="20"/>
         </w:rPr>
-        <w:t xml:space="preserve">Engagement  ·  </w:t>
-      </w:r>
-      <w:r>
-        <w:rPr>
-          <w:rFonts w:ascii="Calibri" w:cs="Calibri" w:eastAsia="Calibri" w:hAnsi="Calibri"/>
-          <w:b/>
-          <w:bCs/>
-          <w:color w:val="B91C1C"/>
+        <w:t xml:space="preserve">Social  ·  </w:t>
+      </w:r>
+      <w:r>
+        <w:rPr>
+          <w:rFonts w:ascii="Calibri" w:cs="Calibri" w:eastAsia="Calibri" w:hAnsi="Calibri"/>
+          <w:b/>
+          <w:bCs/>
+          <w:color w:val="B45309"/>
           <w:sz w:val="20"/>
           <w:szCs w:val="20"/>
         </w:rPr>
-        <w:t xml:space="preserve">Priority: High</w:t>
+        <w:t xml:space="preserve">Priority: Medium</w:t>
       </w:r>
       <w:r>
         <w:rPr>
@@ -4091,6 +5114,17 @@
         </w:rPr>
         <w:t xml:space="preserve">  ·  Effort: Small (days)</w:t>
       </w:r>
+      <w:r>
+        <w:rPr>
+          <w:rFonts w:ascii="Calibri" w:cs="Calibri" w:eastAsia="Calibri" w:hAnsi="Calibri"/>
+          <w:b/>
+          <w:bCs/>
+          <w:color w:val="4F46E5"/>
+          <w:sz w:val="20"/>
+          <w:szCs w:val="20"/>
+        </w:rPr>
+        <w:t xml:space="preserve">  ·  New</w:t>
+      </w:r>
     </w:p>
     <w:p>
       <w:pPr>
@@ -4112,7 +5146,7 @@
           <w:sz w:val="22"/>
           <w:szCs w:val="22"/>
         </w:rPr>
-        <w:t xml:space="preserve">Gives players a reason to open the app every day, the main retention lever for idle games.</w:t>
+        <w:t xml:space="preserve">Players can see their own profile, but not anyone else's. Looking at the leaders' luxury collections is a strong motivator.</w:t>
       </w:r>
     </w:p>
     <w:p>
@@ -4146,7 +5180,7 @@
           <w:sz w:val="22"/>
           <w:szCs w:val="22"/>
         </w:rPr>
-        <w:t xml:space="preserve">A reward on the first visit of each day; it grows with consecutive days (day 1 → day 7).</w:t>
+        <w:t xml:space="preserve">Click a name on the leaderboard to open that player's public profile: company, prestige, all-time earnings, achievements and luxury collection.</w:t>
       </w:r>
     </w:p>
     <w:p>
@@ -4164,7 +5198,7 @@
           <w:sz w:val="22"/>
           <w:szCs w:val="22"/>
         </w:rPr>
-        <w:t xml:space="preserve">Missing a day resets the streak.</w:t>
+        <w:t xml:space="preserve">Private fields (email, cash) stay hidden.</w:t>
       </w:r>
     </w:p>
     <w:p>
@@ -4198,7 +5232,7 @@
           <w:sz w:val="22"/>
           <w:szCs w:val="22"/>
         </w:rPr>
-        <w:t xml:space="preserve">Backend: LastDailyClaim and Streak on Company; GET/POST /api/game/daily-reward. Reward = minutes of the player's income, so it scales with progress.</w:t>
+        <w:t xml:space="preserve">Backend: GET /api/players/{username} returning public fields only (the profile query already builds most of them).</w:t>
       </w:r>
     </w:p>
     <w:p>
@@ -4216,7 +5250,7 @@
           <w:sz w:val="22"/>
           <w:szCs w:val="22"/>
         </w:rPr>
-        <w:t xml:space="preserve">Frontend: a dialog after the welcome-back one, with the 7-day calendar.</w:t>
+        <w:t xml:space="preserve">Frontend: a /players/:username page reusing the profile components.</w:t>
       </w:r>
     </w:p>
     <w:p>
@@ -4253,7 +5287,7 @@
           <w:rFonts w:ascii="Calibri" w:cs="Calibri" w:eastAsia="Calibri" w:hAnsi="Calibri"/>
           <w:color w:val="4F46E5"/>
         </w:rPr>
-        <w:t xml:space="preserve">Feature 5 — Achievements and milestones</w:t>
+        <w:t xml:space="preserve">Feature 8 — Leaderboard upgrades</w:t>
       </w:r>
     </w:p>
     <w:p>
@@ -4268,7 +5302,7 @@
           <w:sz w:val="20"/>
           <w:szCs w:val="20"/>
         </w:rPr>
-        <w:t xml:space="preserve">Engagement  ·  </w:t>
+        <w:t xml:space="preserve">Social  ·  </w:t>
       </w:r>
       <w:r>
         <w:rPr>
@@ -4288,7 +5322,7 @@
           <w:sz w:val="20"/>
           <w:szCs w:val="20"/>
         </w:rPr>
-        <w:t xml:space="preserve">  ·  Effort: Medium (1–2 weeks)</w:t>
+        <w:t xml:space="preserve">  ·  Effort: Small (days)</w:t>
       </w:r>
     </w:p>
     <w:p>
@@ -4311,7 +5345,7 @@
           <w:sz w:val="22"/>
           <w:szCs w:val="22"/>
         </w:rPr>
-        <w:t xml:space="preserve">Short-term goals between prestiges ("Open 5 businesses", "Earn $1M", "Reach P3").</w:t>
+        <w:t xml:space="preserve">Today there is one global top 50. Smaller, closer competitions motivate more players.</w:t>
       </w:r>
     </w:p>
     <w:p>
@@ -4345,7 +5379,7 @@
           <w:sz w:val="22"/>
           <w:szCs w:val="22"/>
         </w:rPr>
-        <w:t xml:space="preserve">A list of achievements with progress bars; each unlocked one gives a cash reward or a small permanent bonus.</w:t>
+        <w:t xml:space="preserve">Tabs: Global, My country, This week (seasonal reset of a weekly score).</w:t>
       </w:r>
     </w:p>
     <w:p>
@@ -4363,7 +5397,7 @@
           <w:sz w:val="22"/>
           <w:szCs w:val="22"/>
         </w:rPr>
-        <w:t xml:space="preserve">A toast appears the moment one unlocks.</w:t>
+        <w:t xml:space="preserve">Always show the player's own rank, even outside the top 50.</w:t>
       </w:r>
     </w:p>
     <w:p>
@@ -4397,7 +5431,7 @@
           <w:sz w:val="22"/>
           <w:szCs w:val="22"/>
         </w:rPr>
-        <w:t xml:space="preserve">Backend: achievements defined as content (like the catalogue), unlocked achievements per company, checked inside the domain events already raised (BusinessOpenedEvent, PrestigeTriggeredEvent).</w:t>
+        <w:t xml:space="preserve">Backend: filter by country (already stored), a weekly earnings column reset by a scheduled job; the rank query already exists for the profile.</w:t>
       </w:r>
     </w:p>
     <w:p>
@@ -4415,7 +5449,7 @@
           <w:sz w:val="22"/>
           <w:szCs w:val="22"/>
         </w:rPr>
-        <w:t xml:space="preserve">Frontend: an "Achievements" page and a toast.</w:t>
+        <w:t xml:space="preserve">Frontend: tabs and a pinned "You" row on the leaderboard page.</w:t>
       </w:r>
     </w:p>
     <w:p>
@@ -4452,7 +5486,7 @@
           <w:rFonts w:ascii="Calibri" w:cs="Calibri" w:eastAsia="Calibri" w:hAnsi="Calibri"/>
           <w:color w:val="4F46E5"/>
         </w:rPr>
-        <w:t xml:space="preserve">Feature 6 — Random events</w:t>
+        <w:t xml:space="preserve">Feature 9 — Onboarding tutorial</w:t>
       </w:r>
     </w:p>
     <w:p>
@@ -4467,7 +5501,7 @@
           <w:sz w:val="20"/>
           <w:szCs w:val="20"/>
         </w:rPr>
-        <w:t xml:space="preserve">Engagement  ·  </w:t>
+        <w:t xml:space="preserve">Platform  ·  </w:t>
       </w:r>
       <w:r>
         <w:rPr>
@@ -4487,7 +5521,7 @@
           <w:sz w:val="20"/>
           <w:szCs w:val="20"/>
         </w:rPr>
-        <w:t xml:space="preserve">  ·  Effort: Medium (1–2 weeks)</w:t>
+        <w:t xml:space="preserve">  ·  Effort: Small (days)</w:t>
       </w:r>
     </w:p>
     <w:p>
@@ -4510,7 +5544,7 @@
           <w:sz w:val="22"/>
           <w:szCs w:val="22"/>
         </w:rPr>
-        <w:t xml:space="preserve">Breaks the routine and creates moments worth reacting to.</w:t>
+        <w:t xml:space="preserve">New players do not know what prestige, assets, levels, managers or offline income mean.</w:t>
       </w:r>
     </w:p>
     <w:p>
@@ -4544,7 +5578,7 @@
           <w:sz w:val="22"/>
           <w:szCs w:val="22"/>
         </w:rPr>
-        <w:t xml:space="preserve">Temporary events: "Market boom — Stock Market ×2 for 10 min", "Fuel crisis — Transport −20 %", "Tax inspection — pay 5 % or risk a fine".</w:t>
+        <w:t xml:space="preserve">A short guided first session: open your first business, buy an asset, level it up, hire a manager, learn about prestige.</w:t>
       </w:r>
     </w:p>
     <w:p>
@@ -4562,7 +5596,7 @@
           <w:sz w:val="22"/>
           <w:szCs w:val="22"/>
         </w:rPr>
-        <w:t xml:space="preserve">Some are good, some bad, some are choices.</w:t>
+        <w:t xml:space="preserve">Can be skipped and replayed from the profile.</w:t>
       </w:r>
     </w:p>
     <w:p>
@@ -4596,25 +5630,7 @@
           <w:sz w:val="22"/>
           <w:szCs w:val="22"/>
         </w:rPr>
-        <w:t xml:space="preserve">Backend: active event stored on the company with start/end; income formula applies its multiplier; the /sync ceiling must include it.</w:t>
-      </w:r>
-    </w:p>
-    <w:p>
-      <w:pPr>
-        <w:pStyle w:val="ListParagraph"/>
-        <w:numPr>
-          <w:ilvl w:val="0"/>
-          <w:numId w:val="2"/>
-        </w:numPr>
-        <w:spacing w:after="60"/>
-      </w:pPr>
-      <w:r>
-        <w:rPr>
-          <w:rFonts w:ascii="Calibri" w:cs="Calibri" w:eastAsia="Calibri" w:hAnsi="Calibri"/>
-          <w:sz w:val="22"/>
-          <w:szCs w:val="22"/>
-        </w:rPr>
-        <w:t xml:space="preserve">Frontend: an event banner with a countdown.</w:t>
+        <w:t xml:space="preserve">Frontend only: a step-by-step overlay pointing at real buttons; progress kept per player; texts in all three languages.</w:t>
       </w:r>
     </w:p>
     <w:p>
@@ -4651,7 +5667,7 @@
           <w:rFonts w:ascii="Calibri" w:cs="Calibri" w:eastAsia="Calibri" w:hAnsi="Calibri"/>
           <w:color w:val="4F46E5"/>
         </w:rPr>
-        <w:t xml:space="preserve">Feature 7 — Admin catalogue editor (UI)</w:t>
+        <w:t xml:space="preserve">Feature 10 — Manager upgrades</w:t>
       </w:r>
     </w:p>
     <w:p>
@@ -4666,7 +5682,7 @@
           <w:sz w:val="20"/>
           <w:szCs w:val="20"/>
         </w:rPr>
-        <w:t xml:space="preserve">Admin &amp; content  ·  </w:t>
+        <w:t xml:space="preserve">Core gameplay  ·  </w:t>
       </w:r>
       <w:r>
         <w:rPr>
@@ -4686,7 +5702,18 @@
           <w:sz w:val="20"/>
           <w:szCs w:val="20"/>
         </w:rPr>
-        <w:t xml:space="preserve">  ·  Effort: Medium (1–2 weeks)</w:t>
+        <w:t xml:space="preserve">  ·  Effort: Small (days)</w:t>
+      </w:r>
+      <w:r>
+        <w:rPr>
+          <w:rFonts w:ascii="Calibri" w:cs="Calibri" w:eastAsia="Calibri" w:hAnsi="Calibri"/>
+          <w:b/>
+          <w:bCs/>
+          <w:color w:val="4F46E5"/>
+          <w:sz w:val="20"/>
+          <w:szCs w:val="20"/>
+        </w:rPr>
+        <w:t xml:space="preserve">  ·  New</w:t>
       </w:r>
     </w:p>
     <w:p>
@@ -4709,7 +5736,7 @@
           <w:sz w:val="22"/>
           <w:szCs w:val="22"/>
         </w:rPr>
-        <w:t xml:space="preserve">The catalogue is in the database and editable through /api/admin/catalogue, but only by API calls. A screen makes balancing the game a matter of minutes.</w:t>
+        <w:t xml:space="preserve">Managers work 4-hour shifts and must be rehired one by one. With many businesses this becomes a chore.</w:t>
       </w:r>
     </w:p>
     <w:p>
@@ -4743,7 +5770,7 @@
           <w:sz w:val="22"/>
           <w:szCs w:val="22"/>
         </w:rPr>
-        <w:t xml:space="preserve">Admin-only page: list of businesses per prestige level, create / edit / retire, manage each business's assets.</w:t>
+        <w:t xml:space="preserve">"Hire all" button: one manager for every business that has none, at the total price.</w:t>
       </w:r>
     </w:p>
     <w:p>
@@ -4761,7 +5788,25 @@
           <w:sz w:val="22"/>
           <w:szCs w:val="22"/>
         </w:rPr>
-        <w:t xml:space="preserve">Live preview of payback time (cost ÷ income) to help balancing.</w:t>
+        <w:t xml:space="preserve">Longer shifts to buy (8 h, 12 h) at a higher price.</w:t>
+      </w:r>
+    </w:p>
+    <w:p>
+      <w:pPr>
+        <w:pStyle w:val="ListParagraph"/>
+        <w:numPr>
+          <w:ilvl w:val="0"/>
+          <w:numId w:val="2"/>
+        </w:numPr>
+        <w:spacing w:after="60"/>
+      </w:pPr>
+      <w:r>
+        <w:rPr>
+          <w:rFonts w:ascii="Calibri" w:cs="Calibri" w:eastAsia="Calibri" w:hAnsi="Calibri"/>
+          <w:sz w:val="22"/>
+          <w:szCs w:val="22"/>
+        </w:rPr>
+        <w:t xml:space="preserve">Optional auto-renew: the shift restarts automatically if the cash is there.</w:t>
       </w:r>
     </w:p>
     <w:p>
@@ -4795,7 +5840,7 @@
           <w:sz w:val="22"/>
           <w:szCs w:val="22"/>
         </w:rPr>
-        <w:t xml:space="preserve">Backend: nothing — the API exists (contract §7).</w:t>
+        <w:t xml:space="preserve">Backend: shift length as a parameter of the hire rule; a batch endpoint; auto-renew applied when /state credits offline time.</w:t>
       </w:r>
     </w:p>
     <w:p>
@@ -4813,7 +5858,7 @@
           <w:sz w:val="22"/>
           <w:szCs w:val="22"/>
         </w:rPr>
-        <w:t xml:space="preserve">Frontend: a lazy /admin route behind an admin guard reading the role claim. Closes contract mismatch M12.</w:t>
+        <w:t xml:space="preserve">Frontend: options in the manage-business dialog and a "Hire all" action on the dashboard.</w:t>
       </w:r>
     </w:p>
     <w:p>
@@ -4850,7 +5895,7 @@
           <w:rFonts w:ascii="Calibri" w:cs="Calibri" w:eastAsia="Calibri" w:hAnsi="Calibri"/>
           <w:color w:val="4F46E5"/>
         </w:rPr>
-        <w:t xml:space="preserve">Feature 8 — Player marketplace</w:t>
+        <w:t xml:space="preserve">Feature 11 — Random events</w:t>
       </w:r>
     </w:p>
     <w:p>
@@ -4865,19 +5910,198 @@
           <w:sz w:val="20"/>
           <w:szCs w:val="20"/>
         </w:rPr>
-        <w:t xml:space="preserve">Economy  ·  </w:t>
-      </w:r>
-      <w:r>
-        <w:rPr>
-          <w:rFonts w:ascii="Calibri" w:cs="Calibri" w:eastAsia="Calibri" w:hAnsi="Calibri"/>
-          <w:b/>
-          <w:bCs/>
+        <w:t xml:space="preserve">Engagement  ·  </w:t>
+      </w:r>
+      <w:r>
+        <w:rPr>
+          <w:rFonts w:ascii="Calibri" w:cs="Calibri" w:eastAsia="Calibri" w:hAnsi="Calibri"/>
+          <w:b/>
+          <w:bCs/>
+          <w:color w:val="B45309"/>
+          <w:sz w:val="20"/>
+          <w:szCs w:val="20"/>
+        </w:rPr>
+        <w:t xml:space="preserve">Priority: Medium</w:t>
+      </w:r>
+      <w:r>
+        <w:rPr>
+          <w:rFonts w:ascii="Calibri" w:cs="Calibri" w:eastAsia="Calibri" w:hAnsi="Calibri"/>
           <w:color w:val="64748B"/>
           <w:sz w:val="20"/>
           <w:szCs w:val="20"/>
         </w:rPr>
-        <w:t xml:space="preserve">Priority: Low</w:t>
-      </w:r>
+        <w:t xml:space="preserve">  ·  Effort: Medium (1–2 weeks)</w:t>
+      </w:r>
+    </w:p>
+    <w:p>
+      <w:pPr>
+        <w:spacing w:after="80"/>
+      </w:pPr>
+      <w:r>
+        <w:rPr>
+          <w:rFonts w:ascii="Calibri" w:cs="Calibri" w:eastAsia="Calibri" w:hAnsi="Calibri"/>
+          <w:b/>
+          <w:bCs/>
+          <w:sz w:val="22"/>
+          <w:szCs w:val="22"/>
+        </w:rPr>
+        <w:t xml:space="preserve">Why: </w:t>
+      </w:r>
+      <w:r>
+        <w:rPr>
+          <w:rFonts w:ascii="Calibri" w:cs="Calibri" w:eastAsia="Calibri" w:hAnsi="Calibri"/>
+          <w:sz w:val="22"/>
+          <w:szCs w:val="22"/>
+        </w:rPr>
+        <w:t xml:space="preserve">Breaks the routine and creates moments worth reacting to.</w:t>
+      </w:r>
+    </w:p>
+    <w:p>
+      <w:pPr>
+        <w:keepNext/>
+        <w:spacing w:after="60" w:before="80"/>
+      </w:pPr>
+      <w:r>
+        <w:rPr>
+          <w:rFonts w:ascii="Calibri" w:cs="Calibri" w:eastAsia="Calibri" w:hAnsi="Calibri"/>
+          <w:b/>
+          <w:bCs/>
+          <w:sz w:val="22"/>
+          <w:szCs w:val="22"/>
+        </w:rPr>
+        <w:t xml:space="preserve">What it does</w:t>
+      </w:r>
+    </w:p>
+    <w:p>
+      <w:pPr>
+        <w:pStyle w:val="ListParagraph"/>
+        <w:numPr>
+          <w:ilvl w:val="0"/>
+          <w:numId w:val="2"/>
+        </w:numPr>
+        <w:spacing w:after="60"/>
+      </w:pPr>
+      <w:r>
+        <w:rPr>
+          <w:rFonts w:ascii="Calibri" w:cs="Calibri" w:eastAsia="Calibri" w:hAnsi="Calibri"/>
+          <w:sz w:val="22"/>
+          <w:szCs w:val="22"/>
+        </w:rPr>
+        <w:t xml:space="preserve">Temporary events: "Market boom — Stock Market ×2 for 10 min", "Fuel crisis — Transport −20 %", "Tax inspection — pay 5 % or risk a fine".</w:t>
+      </w:r>
+    </w:p>
+    <w:p>
+      <w:pPr>
+        <w:pStyle w:val="ListParagraph"/>
+        <w:numPr>
+          <w:ilvl w:val="0"/>
+          <w:numId w:val="2"/>
+        </w:numPr>
+        <w:spacing w:after="60"/>
+      </w:pPr>
+      <w:r>
+        <w:rPr>
+          <w:rFonts w:ascii="Calibri" w:cs="Calibri" w:eastAsia="Calibri" w:hAnsi="Calibri"/>
+          <w:sz w:val="22"/>
+          <w:szCs w:val="22"/>
+        </w:rPr>
+        <w:t xml:space="preserve">Some are good, some bad, some are choices.</w:t>
+      </w:r>
+    </w:p>
+    <w:p>
+      <w:pPr>
+        <w:keepNext/>
+        <w:spacing w:after="60" w:before="80"/>
+      </w:pPr>
+      <w:r>
+        <w:rPr>
+          <w:rFonts w:ascii="Calibri" w:cs="Calibri" w:eastAsia="Calibri" w:hAnsi="Calibri"/>
+          <w:b/>
+          <w:bCs/>
+          <w:sz w:val="22"/>
+          <w:szCs w:val="22"/>
+        </w:rPr>
+        <w:t xml:space="preserve">How</w:t>
+      </w:r>
+    </w:p>
+    <w:p>
+      <w:pPr>
+        <w:pStyle w:val="ListParagraph"/>
+        <w:numPr>
+          <w:ilvl w:val="0"/>
+          <w:numId w:val="2"/>
+        </w:numPr>
+        <w:spacing w:after="60"/>
+      </w:pPr>
+      <w:r>
+        <w:rPr>
+          <w:rFonts w:ascii="Calibri" w:cs="Calibri" w:eastAsia="Calibri" w:hAnsi="Calibri"/>
+          <w:sz w:val="22"/>
+          <w:szCs w:val="22"/>
+        </w:rPr>
+        <w:t xml:space="preserve">Backend: active event stored on the company with start/end; income formula applies its multiplier; the /sync ceiling must include it.</w:t>
+      </w:r>
+    </w:p>
+    <w:p>
+      <w:pPr>
+        <w:pStyle w:val="ListParagraph"/>
+        <w:numPr>
+          <w:ilvl w:val="0"/>
+          <w:numId w:val="2"/>
+        </w:numPr>
+        <w:spacing w:after="60"/>
+      </w:pPr>
+      <w:r>
+        <w:rPr>
+          <w:rFonts w:ascii="Calibri" w:cs="Calibri" w:eastAsia="Calibri" w:hAnsi="Calibri"/>
+          <w:sz w:val="22"/>
+          <w:szCs w:val="22"/>
+        </w:rPr>
+        <w:t xml:space="preserve">Frontend: an event banner with a countdown.</w:t>
+      </w:r>
+    </w:p>
+    <w:p>
+      <w:pPr>
+        <w:spacing w:after="80"/>
+      </w:pPr>
+      <w:r>
+        <w:rPr>
+          <w:rFonts w:ascii="Calibri" w:cs="Calibri" w:eastAsia="Calibri" w:hAnsi="Calibri"/>
+          <w:b/>
+          <w:bCs/>
+          <w:sz w:val="22"/>
+          <w:szCs w:val="22"/>
+        </w:rPr>
+        <w:t xml:space="preserve">Depends on: </w:t>
+      </w:r>
+      <w:r>
+        <w:rPr>
+          <w:rFonts w:ascii="Calibri" w:cs="Calibri" w:eastAsia="Calibri" w:hAnsi="Calibri"/>
+          <w:sz w:val="22"/>
+          <w:szCs w:val="22"/>
+        </w:rPr>
+        <w:t xml:space="preserve">None</w:t>
+      </w:r>
+    </w:p>
+    <w:p>
+      <w:pPr>
+        <w:pStyle w:val="Heading2"/>
+        <w:keepNext/>
+        <w:spacing w:after="120" w:before="320"/>
+      </w:pPr>
+      <w:r>
+        <w:rPr>
+          <w:rFonts w:ascii="Calibri" w:cs="Calibri" w:eastAsia="Calibri" w:hAnsi="Calibri"/>
+          <w:color w:val="4F46E5"/>
+        </w:rPr>
+        <w:t xml:space="preserve">Feature 12 — Prestige perks</w:t>
+      </w:r>
+    </w:p>
+    <w:p>
+      <w:pPr>
+        <w:keepNext/>
+        <w:spacing w:after="120"/>
+      </w:pPr>
       <w:r>
         <w:rPr>
           <w:rFonts w:ascii="Calibri" w:cs="Calibri" w:eastAsia="Calibri" w:hAnsi="Calibri"/>
@@ -4885,7 +6109,38 @@
           <w:sz w:val="20"/>
           <w:szCs w:val="20"/>
         </w:rPr>
-        <w:t xml:space="preserve">  ·  Effort: Large (weeks)</w:t>
+        <w:t xml:space="preserve">Core gameplay  ·  </w:t>
+      </w:r>
+      <w:r>
+        <w:rPr>
+          <w:rFonts w:ascii="Calibri" w:cs="Calibri" w:eastAsia="Calibri" w:hAnsi="Calibri"/>
+          <w:b/>
+          <w:bCs/>
+          <w:color w:val="B45309"/>
+          <w:sz w:val="20"/>
+          <w:szCs w:val="20"/>
+        </w:rPr>
+        <w:t xml:space="preserve">Priority: Medium</w:t>
+      </w:r>
+      <w:r>
+        <w:rPr>
+          <w:rFonts w:ascii="Calibri" w:cs="Calibri" w:eastAsia="Calibri" w:hAnsi="Calibri"/>
+          <w:color w:val="64748B"/>
+          <w:sz w:val="20"/>
+          <w:szCs w:val="20"/>
+        </w:rPr>
+        <w:t xml:space="preserve">  ·  Effort: Medium (1–2 weeks)</w:t>
+      </w:r>
+      <w:r>
+        <w:rPr>
+          <w:rFonts w:ascii="Calibri" w:cs="Calibri" w:eastAsia="Calibri" w:hAnsi="Calibri"/>
+          <w:b/>
+          <w:bCs/>
+          <w:color w:val="4F46E5"/>
+          <w:sz w:val="20"/>
+          <w:szCs w:val="20"/>
+        </w:rPr>
+        <w:t xml:space="preserve">  ·  New</w:t>
       </w:r>
     </w:p>
     <w:p>
@@ -4908,7 +6163,7 @@
           <w:sz w:val="22"/>
           <w:szCs w:val="22"/>
         </w:rPr>
-        <w:t xml:space="preserve">Lets players trade businesses with each other — a social economy instead of closing a business at a 10 % loss.</w:t>
+        <w:t xml:space="preserve">Prestige now only raises the multiplier. A choice at each level makes every prestige feel different and lets players build a strategy.</w:t>
       </w:r>
     </w:p>
     <w:p>
@@ -4942,7 +6197,7 @@
           <w:sz w:val="22"/>
           <w:szCs w:val="22"/>
         </w:rPr>
-        <w:t xml:space="preserve">List an owned business for sale at an asking price; other players browse and buy it with its assets.</w:t>
+        <w:t xml:space="preserve">Each prestige grants a perk point to spend in a small tree.</w:t>
       </w:r>
     </w:p>
     <w:p>
@@ -4960,7 +6215,7 @@
           <w:sz w:val="22"/>
           <w:szCs w:val="22"/>
         </w:rPr>
-        <w:t xml:space="preserve">A small market fee goes to "the house".</w:t>
+        <w:t xml:space="preserve">Examples: offline cap 4 h → 6 h, managers 20 % cheaper, +10 % asset income, level-ups 10 % cheaper.</w:t>
       </w:r>
     </w:p>
     <w:p>
@@ -4994,7 +6249,7 @@
           <w:sz w:val="22"/>
           <w:szCs w:val="22"/>
         </w:rPr>
-        <w:t xml:space="preserve">Backend: half-modelled already (Business.ListForSale, AskingPrice, Company.ListBusinessForSale). Needs the buyer side, a transfer between two aggregates in one transaction, and endpoints.</w:t>
+        <w:t xml:space="preserve">Backend: perks as rules in code (like achievements), chosen perks per company, applied in the income, offline and price formulas; POST /api/game/perks/{code}.</w:t>
       </w:r>
     </w:p>
     <w:p>
@@ -5012,7 +6267,7 @@
           <w:sz w:val="22"/>
           <w:szCs w:val="22"/>
         </w:rPr>
-        <w:t xml:space="preserve">Frontend: a "Market" page and a "Sell" action in manage-business.</w:t>
+        <w:t xml:space="preserve">Frontend: a perk tree on the dashboard after prestige.</w:t>
       </w:r>
     </w:p>
     <w:p>
@@ -5035,7 +6290,7 @@
           <w:sz w:val="22"/>
           <w:szCs w:val="22"/>
         </w:rPr>
-        <w:t xml:space="preserve">Business automation (so bought businesses keep their state)</w:t>
+        <w:t xml:space="preserve">None</w:t>
       </w:r>
     </w:p>
     <w:p>
@@ -5049,7 +6304,7 @@
           <w:rFonts w:ascii="Calibri" w:cs="Calibri" w:eastAsia="Calibri" w:hAnsi="Calibri"/>
           <w:color w:val="4F46E5"/>
         </w:rPr>
-        <w:t xml:space="preserve">Feature 9 — Luxury assets (status items)</w:t>
+        <w:t xml:space="preserve">Feature 13 — Sector synergies and luxury collections</w:t>
       </w:r>
     </w:p>
     <w:p>
@@ -5071,12 +6326,202 @@
           <w:rFonts w:ascii="Calibri" w:cs="Calibri" w:eastAsia="Calibri" w:hAnsi="Calibri"/>
           <w:b/>
           <w:bCs/>
+          <w:color w:val="B45309"/>
+          <w:sz w:val="20"/>
+          <w:szCs w:val="20"/>
+        </w:rPr>
+        <w:t xml:space="preserve">Priority: Medium</w:t>
+      </w:r>
+      <w:r>
+        <w:rPr>
+          <w:rFonts w:ascii="Calibri" w:cs="Calibri" w:eastAsia="Calibri" w:hAnsi="Calibri"/>
           <w:color w:val="64748B"/>
           <w:sz w:val="20"/>
           <w:szCs w:val="20"/>
         </w:rPr>
-        <w:t xml:space="preserve">Priority: Low</w:t>
-      </w:r>
+        <w:t xml:space="preserve">  ·  Effort: Medium (1–2 weeks)</w:t>
+      </w:r>
+      <w:r>
+        <w:rPr>
+          <w:rFonts w:ascii="Calibri" w:cs="Calibri" w:eastAsia="Calibri" w:hAnsi="Calibri"/>
+          <w:b/>
+          <w:bCs/>
+          <w:color w:val="4F46E5"/>
+          <w:sz w:val="20"/>
+          <w:szCs w:val="20"/>
+        </w:rPr>
+        <w:t xml:space="preserve">  ·  New</w:t>
+      </w:r>
+    </w:p>
+    <w:p>
+      <w:pPr>
+        <w:spacing w:after="80"/>
+      </w:pPr>
+      <w:r>
+        <w:rPr>
+          <w:rFonts w:ascii="Calibri" w:cs="Calibri" w:eastAsia="Calibri" w:hAnsi="Calibri"/>
+          <w:b/>
+          <w:bCs/>
+          <w:sz w:val="22"/>
+          <w:szCs w:val="22"/>
+        </w:rPr>
+        <w:t xml:space="preserve">Why: </w:t>
+      </w:r>
+      <w:r>
+        <w:rPr>
+          <w:rFonts w:ascii="Calibri" w:cs="Calibri" w:eastAsia="Calibri" w:hAnsi="Calibri"/>
+          <w:sz w:val="22"/>
+          <w:szCs w:val="22"/>
+        </w:rPr>
+        <w:t xml:space="preserve">Gives a reason to own whole sets instead of only the best-paying businesses, and gives luxury items a goal beyond status.</w:t>
+      </w:r>
+    </w:p>
+    <w:p>
+      <w:pPr>
+        <w:keepNext/>
+        <w:spacing w:after="60" w:before="80"/>
+      </w:pPr>
+      <w:r>
+        <w:rPr>
+          <w:rFonts w:ascii="Calibri" w:cs="Calibri" w:eastAsia="Calibri" w:hAnsi="Calibri"/>
+          <w:b/>
+          <w:bCs/>
+          <w:sz w:val="22"/>
+          <w:szCs w:val="22"/>
+        </w:rPr>
+        <w:t xml:space="preserve">What it does</w:t>
+      </w:r>
+    </w:p>
+    <w:p>
+      <w:pPr>
+        <w:pStyle w:val="ListParagraph"/>
+        <w:numPr>
+          <w:ilvl w:val="0"/>
+          <w:numId w:val="2"/>
+        </w:numPr>
+        <w:spacing w:after="60"/>
+      </w:pPr>
+      <w:r>
+        <w:rPr>
+          <w:rFonts w:ascii="Calibri" w:cs="Calibri" w:eastAsia="Calibri" w:hAnsi="Calibri"/>
+          <w:sz w:val="22"/>
+          <w:szCs w:val="22"/>
+        </w:rPr>
+        <w:t xml:space="preserve">Own every business of a sector → +10 % income for that sector.</w:t>
+      </w:r>
+    </w:p>
+    <w:p>
+      <w:pPr>
+        <w:pStyle w:val="ListParagraph"/>
+        <w:numPr>
+          <w:ilvl w:val="0"/>
+          <w:numId w:val="2"/>
+        </w:numPr>
+        <w:spacing w:after="60"/>
+      </w:pPr>
+      <w:r>
+        <w:rPr>
+          <w:rFonts w:ascii="Calibri" w:cs="Calibri" w:eastAsia="Calibri" w:hAnsi="Calibri"/>
+          <w:sz w:val="22"/>
+          <w:szCs w:val="22"/>
+        </w:rPr>
+        <w:t xml:space="preserve">Complete a luxury category (all watches, all cars…) → a badge on the profile and a small bonus.</w:t>
+      </w:r>
+    </w:p>
+    <w:p>
+      <w:pPr>
+        <w:keepNext/>
+        <w:spacing w:after="60" w:before="80"/>
+      </w:pPr>
+      <w:r>
+        <w:rPr>
+          <w:rFonts w:ascii="Calibri" w:cs="Calibri" w:eastAsia="Calibri" w:hAnsi="Calibri"/>
+          <w:b/>
+          <w:bCs/>
+          <w:sz w:val="22"/>
+          <w:szCs w:val="22"/>
+        </w:rPr>
+        <w:t xml:space="preserve">How</w:t>
+      </w:r>
+    </w:p>
+    <w:p>
+      <w:pPr>
+        <w:pStyle w:val="ListParagraph"/>
+        <w:numPr>
+          <w:ilvl w:val="0"/>
+          <w:numId w:val="2"/>
+        </w:numPr>
+        <w:spacing w:after="60"/>
+      </w:pPr>
+      <w:r>
+        <w:rPr>
+          <w:rFonts w:ascii="Calibri" w:cs="Calibri" w:eastAsia="Calibri" w:hAnsi="Calibri"/>
+          <w:sz w:val="22"/>
+          <w:szCs w:val="22"/>
+        </w:rPr>
+        <w:t xml:space="preserve">Backend: synergy and collection bonuses computed from what the company owns, included in incomePerSecond (and so in the /sync ceiling).</w:t>
+      </w:r>
+    </w:p>
+    <w:p>
+      <w:pPr>
+        <w:pStyle w:val="ListParagraph"/>
+        <w:numPr>
+          <w:ilvl w:val="0"/>
+          <w:numId w:val="2"/>
+        </w:numPr>
+        <w:spacing w:after="60"/>
+      </w:pPr>
+      <w:r>
+        <w:rPr>
+          <w:rFonts w:ascii="Calibri" w:cs="Calibri" w:eastAsia="Calibri" w:hAnsi="Calibri"/>
+          <w:sz w:val="22"/>
+          <w:szCs w:val="22"/>
+        </w:rPr>
+        <w:t xml:space="preserve">Frontend: sector progress on the businesses page; collection progress on the luxury page.</w:t>
+      </w:r>
+    </w:p>
+    <w:p>
+      <w:pPr>
+        <w:spacing w:after="80"/>
+      </w:pPr>
+      <w:r>
+        <w:rPr>
+          <w:rFonts w:ascii="Calibri" w:cs="Calibri" w:eastAsia="Calibri" w:hAnsi="Calibri"/>
+          <w:b/>
+          <w:bCs/>
+          <w:sz w:val="22"/>
+          <w:szCs w:val="22"/>
+        </w:rPr>
+        <w:t xml:space="preserve">Depends on: </w:t>
+      </w:r>
+      <w:r>
+        <w:rPr>
+          <w:rFonts w:ascii="Calibri" w:cs="Calibri" w:eastAsia="Calibri" w:hAnsi="Calibri"/>
+          <w:sz w:val="22"/>
+          <w:szCs w:val="22"/>
+        </w:rPr>
+        <w:t xml:space="preserve">None</w:t>
+      </w:r>
+    </w:p>
+    <w:p>
+      <w:pPr>
+        <w:pStyle w:val="Heading2"/>
+        <w:keepNext/>
+        <w:spacing w:after="120" w:before="320"/>
+      </w:pPr>
+      <w:r>
+        <w:rPr>
+          <w:rFonts w:ascii="Calibri" w:cs="Calibri" w:eastAsia="Calibri" w:hAnsi="Calibri"/>
+          <w:color w:val="4F46E5"/>
+        </w:rPr>
+        <w:t xml:space="preserve">Feature 14 — Translated game content</w:t>
+      </w:r>
+    </w:p>
+    <w:p>
+      <w:pPr>
+        <w:keepNext/>
+        <w:spacing w:after="120"/>
+      </w:pPr>
       <w:r>
         <w:rPr>
           <w:rFonts w:ascii="Calibri" w:cs="Calibri" w:eastAsia="Calibri" w:hAnsi="Calibri"/>
@@ -5084,8 +6529,39 @@
           <w:sz w:val="20"/>
           <w:szCs w:val="20"/>
         </w:rPr>
+        <w:t xml:space="preserve">Platform  ·  </w:t>
+      </w:r>
+      <w:r>
+        <w:rPr>
+          <w:rFonts w:ascii="Calibri" w:cs="Calibri" w:eastAsia="Calibri" w:hAnsi="Calibri"/>
+          <w:b/>
+          <w:bCs/>
+          <w:color w:val="B45309"/>
+          <w:sz w:val="20"/>
+          <w:szCs w:val="20"/>
+        </w:rPr>
+        <w:t xml:space="preserve">Priority: Medium</w:t>
+      </w:r>
+      <w:r>
+        <w:rPr>
+          <w:rFonts w:ascii="Calibri" w:cs="Calibri" w:eastAsia="Calibri" w:hAnsi="Calibri"/>
+          <w:color w:val="64748B"/>
+          <w:sz w:val="20"/>
+          <w:szCs w:val="20"/>
+        </w:rPr>
         <w:t xml:space="preserve">  ·  Effort: Medium (1–2 weeks)</w:t>
       </w:r>
+      <w:r>
+        <w:rPr>
+          <w:rFonts w:ascii="Calibri" w:cs="Calibri" w:eastAsia="Calibri" w:hAnsi="Calibri"/>
+          <w:b/>
+          <w:bCs/>
+          <w:color w:val="4F46E5"/>
+          <w:sz w:val="20"/>
+          <w:szCs w:val="20"/>
+        </w:rPr>
+        <w:t xml:space="preserve">  ·  New</w:t>
+      </w:r>
     </w:p>
     <w:p>
       <w:pPr>
@@ -5107,7 +6583,7 @@
           <w:sz w:val="22"/>
           <w:szCs w:val="22"/>
         </w:rPr>
-        <w:t xml:space="preserve">Something to spend on that is not about income: houses, cars, yachts, jets — shown on the profile and the leaderboard.</w:t>
+        <w:t xml:space="preserve">The interface is now in English, French and Arabic, but business, asset and luxury names and descriptions still come from the database in English.</w:t>
       </w:r>
     </w:p>
     <w:p>
@@ -5141,7 +6617,7 @@
           <w:sz w:val="22"/>
           <w:szCs w:val="22"/>
         </w:rPr>
-        <w:t xml:space="preserve">A luxury shop per prestige level; items count toward net worth and give a tiny prestige-style bonus.</w:t>
+        <w:t xml:space="preserve">Catalogue and luxury names and descriptions in all three languages.</w:t>
       </w:r>
     </w:p>
     <w:p>
@@ -5159,7 +6635,7 @@
           <w:sz w:val="22"/>
           <w:szCs w:val="22"/>
         </w:rPr>
-        <w:t xml:space="preserve">Owned items appear on the player's profile.</w:t>
+        <w:t xml:space="preserve">The admin catalogue editor gets a field per language.</w:t>
       </w:r>
     </w:p>
     <w:p>
@@ -5193,7 +6669,7 @@
           <w:sz w:val="22"/>
           <w:szCs w:val="22"/>
         </w:rPr>
-        <w:t xml:space="preserve">Backend: the LuxuryAsset table, mapping and eager loading already exist and NetWorth already counts it — only creation and the shop endpoint are missing.</w:t>
+        <w:t xml:space="preserve">Backend: translation columns (or a translations table) on the catalogue and luxury tables; the API returns the text for the language the client asks for (Accept-Language).</w:t>
       </w:r>
     </w:p>
     <w:p>
@@ -5211,7 +6687,7 @@
           <w:sz w:val="22"/>
           <w:szCs w:val="22"/>
         </w:rPr>
-        <w:t xml:space="preserve">Frontend: a "Luxury" shop page and a profile showcase.</w:t>
+        <w:t xml:space="preserve">Frontend: send the current language with each request; extra fields in the admin editor.</w:t>
       </w:r>
     </w:p>
     <w:p>
@@ -5234,7 +6710,7 @@
           <w:sz w:val="22"/>
           <w:szCs w:val="22"/>
         </w:rPr>
-        <w:t xml:space="preserve">Player profile (feature 12)</w:t>
+        <w:t xml:space="preserve">None</w:t>
       </w:r>
     </w:p>
     <w:p>
@@ -5248,7 +6724,7 @@
           <w:rFonts w:ascii="Calibri" w:cs="Calibri" w:eastAsia="Calibri" w:hAnsi="Calibri"/>
           <w:color w:val="4F46E5"/>
         </w:rPr>
-        <w:t xml:space="preserve">Feature 10 — Bank: loans and deposits</w:t>
+        <w:t xml:space="preserve">Feature 15 — Statistics and charts</w:t>
       </w:r>
     </w:p>
     <w:p>
@@ -5263,7 +6739,7 @@
           <w:sz w:val="20"/>
           <w:szCs w:val="20"/>
         </w:rPr>
-        <w:t xml:space="preserve">Economy  ·  </w:t>
+        <w:t xml:space="preserve">Platform  ·  </w:t>
       </w:r>
       <w:r>
         <w:rPr>
@@ -5283,7 +6759,7 @@
           <w:sz w:val="20"/>
           <w:szCs w:val="20"/>
         </w:rPr>
-        <w:t xml:space="preserve">  ·  Effort: Large (weeks)</w:t>
+        <w:t xml:space="preserve">  ·  Effort: Medium (1–2 weeks)</w:t>
       </w:r>
     </w:p>
     <w:p>
@@ -5306,7 +6782,7 @@
           <w:sz w:val="22"/>
           <w:szCs w:val="22"/>
         </w:rPr>
-        <w:t xml:space="preserve">Adds risk and strategy: borrow to open a business early, or park cash to earn interest.</w:t>
+        <w:t xml:space="preserve">Seeing growth is satisfying and helps players plan.</w:t>
       </w:r>
     </w:p>
     <w:p>
@@ -5340,25 +6816,7 @@
           <w:sz w:val="22"/>
           <w:szCs w:val="22"/>
         </w:rPr>
-        <w:t xml:space="preserve">Borrow up to a share of net worth, repaid automatically from income with interest.</w:t>
-      </w:r>
-    </w:p>
-    <w:p>
-      <w:pPr>
-        <w:pStyle w:val="ListParagraph"/>
-        <w:numPr>
-          <w:ilvl w:val="0"/>
-          <w:numId w:val="2"/>
-        </w:numPr>
-        <w:spacing w:after="60"/>
-      </w:pPr>
-      <w:r>
-        <w:rPr>
-          <w:rFonts w:ascii="Calibri" w:cs="Calibri" w:eastAsia="Calibri" w:hAnsi="Calibri"/>
-          <w:sz w:val="22"/>
-          <w:szCs w:val="22"/>
-        </w:rPr>
-        <w:t xml:space="preserve">Deposit cash for a fixed time to earn interest.</w:t>
+        <w:t xml:space="preserve">Charts: income per second over time, earnings per business, net worth history.</w:t>
       </w:r>
     </w:p>
     <w:p>
@@ -5392,7 +6850,7 @@
           <w:sz w:val="22"/>
           <w:szCs w:val="22"/>
         </w:rPr>
-        <w:t xml:space="preserve">Backend: Loan entity on the company, repayment applied in sync/accrual — careful, this touches the anti-cheat ceiling.</w:t>
+        <w:t xml:space="preserve">Backend: periodic snapshots of key numbers per company.</w:t>
       </w:r>
     </w:p>
     <w:p>
@@ -5410,7 +6868,7 @@
           <w:sz w:val="22"/>
           <w:szCs w:val="22"/>
         </w:rPr>
-        <w:t xml:space="preserve">Frontend: a "Bank" page.</w:t>
+        <w:t xml:space="preserve">Frontend: a Stats page with charts.</w:t>
       </w:r>
     </w:p>
     <w:p>
@@ -5447,7 +6905,7 @@
           <w:rFonts w:ascii="Calibri" w:cs="Calibri" w:eastAsia="Calibri" w:hAnsi="Calibri"/>
           <w:color w:val="4F46E5"/>
         </w:rPr>
-        <w:t xml:space="preserve">Feature 11 — Leaderboard upgrades</w:t>
+        <w:t xml:space="preserve">Feature 16 — Dark mode</w:t>
       </w:r>
     </w:p>
     <w:p>
@@ -5462,26 +6920,26 @@
           <w:sz w:val="20"/>
           <w:szCs w:val="20"/>
         </w:rPr>
-        <w:t xml:space="preserve">Social  ·  </w:t>
-      </w:r>
-      <w:r>
-        <w:rPr>
-          <w:rFonts w:ascii="Calibri" w:cs="Calibri" w:eastAsia="Calibri" w:hAnsi="Calibri"/>
-          <w:b/>
-          <w:bCs/>
-          <w:color w:val="B45309"/>
-          <w:sz w:val="20"/>
-          <w:szCs w:val="20"/>
-        </w:rPr>
-        <w:t xml:space="preserve">Priority: Medium</w:t>
-      </w:r>
-      <w:r>
-        <w:rPr>
-          <w:rFonts w:ascii="Calibri" w:cs="Calibri" w:eastAsia="Calibri" w:hAnsi="Calibri"/>
+        <w:t xml:space="preserve">Platform  ·  </w:t>
+      </w:r>
+      <w:r>
+        <w:rPr>
+          <w:rFonts w:ascii="Calibri" w:cs="Calibri" w:eastAsia="Calibri" w:hAnsi="Calibri"/>
+          <w:b/>
+          <w:bCs/>
           <w:color w:val="64748B"/>
           <w:sz w:val="20"/>
           <w:szCs w:val="20"/>
         </w:rPr>
+        <w:t xml:space="preserve">Priority: Low</w:t>
+      </w:r>
+      <w:r>
+        <w:rPr>
+          <w:rFonts w:ascii="Calibri" w:cs="Calibri" w:eastAsia="Calibri" w:hAnsi="Calibri"/>
+          <w:color w:val="64748B"/>
+          <w:sz w:val="20"/>
+          <w:szCs w:val="20"/>
+        </w:rPr>
         <w:t xml:space="preserve">  ·  Effort: Small (days)</w:t>
       </w:r>
     </w:p>
@@ -5505,7 +6963,7 @@
           <w:sz w:val="22"/>
           <w:szCs w:val="22"/>
         </w:rPr>
-        <w:t xml:space="preserve">Today there is one global top 50. Smaller, closer competitions motivate more players.</w:t>
+        <w:t xml:space="preserve">Many players play at night.</w:t>
       </w:r>
     </w:p>
     <w:p>
@@ -5539,25 +6997,7 @@
           <w:sz w:val="22"/>
           <w:szCs w:val="22"/>
         </w:rPr>
-        <w:t xml:space="preserve">Tabs: Global, My country, This week (seasonal reset of a weekly score).</w:t>
-      </w:r>
-    </w:p>
-    <w:p>
-      <w:pPr>
-        <w:pStyle w:val="ListParagraph"/>
-        <w:numPr>
-          <w:ilvl w:val="0"/>
-          <w:numId w:val="2"/>
-        </w:numPr>
-        <w:spacing w:after="60"/>
-      </w:pPr>
-      <w:r>
-        <w:rPr>
-          <w:rFonts w:ascii="Calibri" w:cs="Calibri" w:eastAsia="Calibri" w:hAnsi="Calibri"/>
-          <w:sz w:val="22"/>
-          <w:szCs w:val="22"/>
-        </w:rPr>
-        <w:t xml:space="preserve">Always show the player's own rank, even outside the top 50.</w:t>
+        <w:t xml:space="preserve">Light / dark / system toggle next to the language picker.</w:t>
       </w:r>
     </w:p>
     <w:p>
@@ -5591,25 +7031,7 @@
           <w:sz w:val="22"/>
           <w:szCs w:val="22"/>
         </w:rPr>
-        <w:t xml:space="preserve">Backend: filter by country (already stored), a weekly earnings column reset by a scheduled job, a "my rank" query.</w:t>
-      </w:r>
-    </w:p>
-    <w:p>
-      <w:pPr>
-        <w:pStyle w:val="ListParagraph"/>
-        <w:numPr>
-          <w:ilvl w:val="0"/>
-          <w:numId w:val="2"/>
-        </w:numPr>
-        <w:spacing w:after="60"/>
-      </w:pPr>
-      <w:r>
-        <w:rPr>
-          <w:rFonts w:ascii="Calibri" w:cs="Calibri" w:eastAsia="Calibri" w:hAnsi="Calibri"/>
-          <w:sz w:val="22"/>
-          <w:szCs w:val="22"/>
-        </w:rPr>
-        <w:t xml:space="preserve">Frontend: tabs and a pinned "You" row on the leaderboard page.</w:t>
+        <w:t xml:space="preserve">Frontend only: the design system already uses colour tokens in styles.scss, so dark mode is a second set of token values.</w:t>
       </w:r>
     </w:p>
     <w:p>
@@ -5646,7 +7068,7 @@
           <w:rFonts w:ascii="Calibri" w:cs="Calibri" w:eastAsia="Calibri" w:hAnsi="Calibri"/>
           <w:color w:val="4F46E5"/>
         </w:rPr>
-        <w:t xml:space="preserve">Feature 12 — Player profile</w:t>
+        <w:t xml:space="preserve">Feature 17 — Admin announcements and audit log</w:t>
       </w:r>
     </w:p>
     <w:p>
@@ -5661,28 +7083,39 @@
           <w:sz w:val="20"/>
           <w:szCs w:val="20"/>
         </w:rPr>
-        <w:t xml:space="preserve">Social  ·  </w:t>
-      </w:r>
-      <w:r>
-        <w:rPr>
-          <w:rFonts w:ascii="Calibri" w:cs="Calibri" w:eastAsia="Calibri" w:hAnsi="Calibri"/>
-          <w:b/>
-          <w:bCs/>
-          <w:color w:val="B45309"/>
-          <w:sz w:val="20"/>
-          <w:szCs w:val="20"/>
-        </w:rPr>
-        <w:t xml:space="preserve">Priority: Medium</w:t>
-      </w:r>
-      <w:r>
-        <w:rPr>
-          <w:rFonts w:ascii="Calibri" w:cs="Calibri" w:eastAsia="Calibri" w:hAnsi="Calibri"/>
+        <w:t xml:space="preserve">Admin &amp; content  ·  </w:t>
+      </w:r>
+      <w:r>
+        <w:rPr>
+          <w:rFonts w:ascii="Calibri" w:cs="Calibri" w:eastAsia="Calibri" w:hAnsi="Calibri"/>
+          <w:b/>
+          <w:bCs/>
           <w:color w:val="64748B"/>
           <w:sz w:val="20"/>
           <w:szCs w:val="20"/>
         </w:rPr>
+        <w:t xml:space="preserve">Priority: Low</w:t>
+      </w:r>
+      <w:r>
+        <w:rPr>
+          <w:rFonts w:ascii="Calibri" w:cs="Calibri" w:eastAsia="Calibri" w:hAnsi="Calibri"/>
+          <w:color w:val="64748B"/>
+          <w:sz w:val="20"/>
+          <w:szCs w:val="20"/>
+        </w:rPr>
         <w:t xml:space="preserve">  ·  Effort: Small (days)</w:t>
       </w:r>
+      <w:r>
+        <w:rPr>
+          <w:rFonts w:ascii="Calibri" w:cs="Calibri" w:eastAsia="Calibri" w:hAnsi="Calibri"/>
+          <w:b/>
+          <w:bCs/>
+          <w:color w:val="4F46E5"/>
+          <w:sz w:val="20"/>
+          <w:szCs w:val="20"/>
+        </w:rPr>
+        <w:t xml:space="preserve">  ·  New</w:t>
+      </w:r>
     </w:p>
     <w:p>
       <w:pPr>
@@ -5704,7 +7137,7 @@
           <w:sz w:val="22"/>
           <w:szCs w:val="22"/>
         </w:rPr>
-        <w:t xml:space="preserve">Players want to see and show their progress.</w:t>
+        <w:t xml:space="preserve">Admins can change cash, reset players and edit the catalogue, but there is no trace of who did what, and no way to tell players about an update.</w:t>
       </w:r>
     </w:p>
     <w:p>
@@ -5738,7 +7171,7 @@
           <w:sz w:val="22"/>
           <w:szCs w:val="22"/>
         </w:rPr>
-        <w:t xml:space="preserve">A profile page: company, prestige, all-time earnings, businesses owned, achievements, join date.</w:t>
+        <w:t xml:space="preserve">An announcement banner shown to every player (e.g. "New businesses added!"), set from the admin panel.</w:t>
       </w:r>
     </w:p>
     <w:p>
@@ -5756,7 +7189,7 @@
           <w:sz w:val="22"/>
           <w:szCs w:val="22"/>
         </w:rPr>
-        <w:t xml:space="preserve">Click a name on the leaderboard to open that player's public profile.</w:t>
+        <w:t xml:space="preserve">An audit log of admin actions: cash changes, resets, role changes, catalogue edits.</w:t>
       </w:r>
     </w:p>
     <w:p>
@@ -5790,7 +7223,7 @@
           <w:sz w:val="22"/>
           <w:szCs w:val="22"/>
         </w:rPr>
-        <w:t xml:space="preserve">Backend: GET /api/players/{username} returning public fields only.</w:t>
+        <w:t xml:space="preserve">Backend: announcements and admin_audit tables; every admin endpoint writes an audit row.</w:t>
       </w:r>
     </w:p>
     <w:p>
@@ -5808,7 +7241,7 @@
           <w:sz w:val="22"/>
           <w:szCs w:val="22"/>
         </w:rPr>
-        <w:t xml:space="preserve">Frontend: /profile and /profile/:username pages.</w:t>
+        <w:t xml:space="preserve">Frontend: a banner in the game layout; a log page in the admin panel.</w:t>
       </w:r>
     </w:p>
     <w:p>
@@ -5845,7 +7278,7 @@
           <w:rFonts w:ascii="Calibri" w:cs="Calibri" w:eastAsia="Calibri" w:hAnsi="Calibri"/>
           <w:color w:val="4F46E5"/>
         </w:rPr>
-        <w:t xml:space="preserve">Feature 13 — Friends and alliances</w:t>
+        <w:t xml:space="preserve">Feature 18 — Player marketplace</w:t>
       </w:r>
     </w:p>
     <w:p>
@@ -5860,7 +7293,7 @@
           <w:sz w:val="20"/>
           <w:szCs w:val="20"/>
         </w:rPr>
-        <w:t xml:space="preserve">Social  ·  </w:t>
+        <w:t xml:space="preserve">Economy  ·  </w:t>
       </w:r>
       <w:r>
         <w:rPr>
@@ -5903,7 +7336,7 @@
           <w:sz w:val="22"/>
           <w:szCs w:val="22"/>
         </w:rPr>
-        <w:t xml:space="preserve">Social pressure and cooperation keep players around longer.</w:t>
+        <w:t xml:space="preserve">Lets players trade businesses with each other — a social economy instead of closing a business at a 10 % loss.</w:t>
       </w:r>
     </w:p>
     <w:p>
@@ -5937,7 +7370,25 @@
           <w:sz w:val="22"/>
           <w:szCs w:val="22"/>
         </w:rPr>
-        <w:t xml:space="preserve">Add friends and compare progress; form alliances (guilds) with a shared weekly goal and a group reward.</w:t>
+        <w:t xml:space="preserve">List an owned business for sale at an asking price; other players browse and buy it with its assets and level.</w:t>
+      </w:r>
+    </w:p>
+    <w:p>
+      <w:pPr>
+        <w:pStyle w:val="ListParagraph"/>
+        <w:numPr>
+          <w:ilvl w:val="0"/>
+          <w:numId w:val="2"/>
+        </w:numPr>
+        <w:spacing w:after="60"/>
+      </w:pPr>
+      <w:r>
+        <w:rPr>
+          <w:rFonts w:ascii="Calibri" w:cs="Calibri" w:eastAsia="Calibri" w:hAnsi="Calibri"/>
+          <w:sz w:val="22"/>
+          <w:szCs w:val="22"/>
+        </w:rPr>
+        <w:t xml:space="preserve">A small market fee goes to "the house".</w:t>
       </w:r>
     </w:p>
     <w:p>
@@ -5971,7 +7422,7 @@
           <w:sz w:val="22"/>
           <w:szCs w:val="22"/>
         </w:rPr>
-        <w:t xml:space="preserve">Backend: friendships and alliances tables, invitations, alliance goal progress.</w:t>
+        <w:t xml:space="preserve">Backend: half-modelled already (Business.ListForSale, AskingPrice, Company.ListBusinessForSale). Needs the buyer side, a transfer between two aggregates in one transaction, and endpoints. Decide what happens to a running manager shift.</w:t>
       </w:r>
     </w:p>
     <w:p>
@@ -5989,7 +7440,7 @@
           <w:sz w:val="22"/>
           <w:szCs w:val="22"/>
         </w:rPr>
-        <w:t xml:space="preserve">Frontend: Friends and Alliance pages.</w:t>
+        <w:t xml:space="preserve">Frontend: a "Market" page and a "Sell" action in manage-business.</w:t>
       </w:r>
     </w:p>
     <w:p>
@@ -6012,7 +7463,7 @@
           <w:sz w:val="22"/>
           <w:szCs w:val="22"/>
         </w:rPr>
-        <w:t xml:space="preserve">Player profile</w:t>
+        <w:t xml:space="preserve">None (managers and levels are shipped)</w:t>
       </w:r>
     </w:p>
     <w:p>
@@ -6026,7 +7477,7 @@
           <w:rFonts w:ascii="Calibri" w:cs="Calibri" w:eastAsia="Calibri" w:hAnsi="Calibri"/>
           <w:color w:val="4F46E5"/>
         </w:rPr>
-        <w:t xml:space="preserve">Feature 14 — Installable mobile app (PWA) and notifications</w:t>
+        <w:t xml:space="preserve">Feature 19 — Bank: loans and deposits</w:t>
       </w:r>
     </w:p>
     <w:p>
@@ -6041,27 +7492,27 @@
           <w:sz w:val="20"/>
           <w:szCs w:val="20"/>
         </w:rPr>
-        <w:t xml:space="preserve">Platform  ·  </w:t>
-      </w:r>
-      <w:r>
-        <w:rPr>
-          <w:rFonts w:ascii="Calibri" w:cs="Calibri" w:eastAsia="Calibri" w:hAnsi="Calibri"/>
-          <w:b/>
-          <w:bCs/>
-          <w:color w:val="B91C1C"/>
-          <w:sz w:val="20"/>
-          <w:szCs w:val="20"/>
-        </w:rPr>
-        <w:t xml:space="preserve">Priority: High</w:t>
-      </w:r>
-      <w:r>
-        <w:rPr>
-          <w:rFonts w:ascii="Calibri" w:cs="Calibri" w:eastAsia="Calibri" w:hAnsi="Calibri"/>
+        <w:t xml:space="preserve">Economy  ·  </w:t>
+      </w:r>
+      <w:r>
+        <w:rPr>
+          <w:rFonts w:ascii="Calibri" w:cs="Calibri" w:eastAsia="Calibri" w:hAnsi="Calibri"/>
+          <w:b/>
+          <w:bCs/>
           <w:color w:val="64748B"/>
           <w:sz w:val="20"/>
           <w:szCs w:val="20"/>
         </w:rPr>
-        <w:t xml:space="preserve">  ·  Effort: Small (days)</w:t>
+        <w:t xml:space="preserve">Priority: Low</w:t>
+      </w:r>
+      <w:r>
+        <w:rPr>
+          <w:rFonts w:ascii="Calibri" w:cs="Calibri" w:eastAsia="Calibri" w:hAnsi="Calibri"/>
+          <w:color w:val="64748B"/>
+          <w:sz w:val="20"/>
+          <w:szCs w:val="20"/>
+        </w:rPr>
+        <w:t xml:space="preserve">  ·  Effort: Large (weeks)</w:t>
       </w:r>
     </w:p>
     <w:p>
@@ -6084,7 +7535,7 @@
           <w:sz w:val="22"/>
           <w:szCs w:val="22"/>
         </w:rPr>
-        <w:t xml:space="preserve">Most idle-game time is on phones. An installable app with an icon feels like a real game and can remind players to come back.</w:t>
+        <w:t xml:space="preserve">Adds risk and strategy: borrow to open a business early, or park cash to earn interest.</w:t>
       </w:r>
     </w:p>
     <w:p>
@@ -6118,7 +7569,7 @@
           <w:sz w:val="22"/>
           <w:szCs w:val="22"/>
         </w:rPr>
-        <w:t xml:space="preserve">"Add to home screen", full-screen launch, app icon and splash.</w:t>
+        <w:t xml:space="preserve">Borrow up to a share of net worth, repaid automatically from income with interest.</w:t>
       </w:r>
     </w:p>
     <w:p>
@@ -6136,7 +7587,7 @@
           <w:sz w:val="22"/>
           <w:szCs w:val="22"/>
         </w:rPr>
-        <w:t xml:space="preserve">Optional push notification: "Your businesses hit the 4-hour offline cap — collect now".</w:t>
+        <w:t xml:space="preserve">Deposit cash for a fixed time to earn interest.</w:t>
       </w:r>
     </w:p>
     <w:p>
@@ -6170,7 +7621,7 @@
           <w:sz w:val="22"/>
           <w:szCs w:val="22"/>
         </w:rPr>
-        <w:t xml:space="preserve">Frontend: Angular service worker + web manifest (ng add @angular/pwa).</w:t>
+        <w:t xml:space="preserve">Backend: Loan entity on the company, repayment applied in sync/accrual — careful, this touches the anti-cheat ceiling.</w:t>
       </w:r>
     </w:p>
     <w:p>
@@ -6188,7 +7639,7 @@
           <w:sz w:val="22"/>
           <w:szCs w:val="22"/>
         </w:rPr>
-        <w:t xml:space="preserve">Backend (push only): store push subscriptions; a background job sends the reminder.</w:t>
+        <w:t xml:space="preserve">Frontend: a "Bank" page.</w:t>
       </w:r>
     </w:p>
     <w:p>
@@ -6211,7 +7662,7 @@
           <w:sz w:val="22"/>
           <w:szCs w:val="22"/>
         </w:rPr>
-        <w:t xml:space="preserve">HTTPS hosting (the dev tunnel already provides it)</w:t>
+        <w:t xml:space="preserve">None</w:t>
       </w:r>
     </w:p>
     <w:p>
@@ -6225,7 +7676,7 @@
           <w:rFonts w:ascii="Calibri" w:cs="Calibri" w:eastAsia="Calibri" w:hAnsi="Calibri"/>
           <w:color w:val="4F46E5"/>
         </w:rPr>
-        <w:t xml:space="preserve">Feature 15 — Onboarding tutorial</w:t>
+        <w:t xml:space="preserve">Feature 20 — Friends and alliances</w:t>
       </w:r>
     </w:p>
     <w:p>
@@ -6240,180 +7691,19 @@
           <w:sz w:val="20"/>
           <w:szCs w:val="20"/>
         </w:rPr>
-        <w:t xml:space="preserve">Platform  ·  </w:t>
-      </w:r>
-      <w:r>
-        <w:rPr>
-          <w:rFonts w:ascii="Calibri" w:cs="Calibri" w:eastAsia="Calibri" w:hAnsi="Calibri"/>
-          <w:b/>
-          <w:bCs/>
-          <w:color w:val="B45309"/>
-          <w:sz w:val="20"/>
-          <w:szCs w:val="20"/>
-        </w:rPr>
-        <w:t xml:space="preserve">Priority: Medium</w:t>
-      </w:r>
-      <w:r>
-        <w:rPr>
-          <w:rFonts w:ascii="Calibri" w:cs="Calibri" w:eastAsia="Calibri" w:hAnsi="Calibri"/>
+        <w:t xml:space="preserve">Social  ·  </w:t>
+      </w:r>
+      <w:r>
+        <w:rPr>
+          <w:rFonts w:ascii="Calibri" w:cs="Calibri" w:eastAsia="Calibri" w:hAnsi="Calibri"/>
+          <w:b/>
+          <w:bCs/>
           <w:color w:val="64748B"/>
           <w:sz w:val="20"/>
           <w:szCs w:val="20"/>
         </w:rPr>
-        <w:t xml:space="preserve">  ·  Effort: Small (days)</w:t>
-      </w:r>
-    </w:p>
-    <w:p>
-      <w:pPr>
-        <w:spacing w:after="80"/>
-      </w:pPr>
-      <w:r>
-        <w:rPr>
-          <w:rFonts w:ascii="Calibri" w:cs="Calibri" w:eastAsia="Calibri" w:hAnsi="Calibri"/>
-          <w:b/>
-          <w:bCs/>
-          <w:sz w:val="22"/>
-          <w:szCs w:val="22"/>
-        </w:rPr>
-        <w:t xml:space="preserve">Why: </w:t>
-      </w:r>
-      <w:r>
-        <w:rPr>
-          <w:rFonts w:ascii="Calibri" w:cs="Calibri" w:eastAsia="Calibri" w:hAnsi="Calibri"/>
-          <w:sz w:val="22"/>
-          <w:szCs w:val="22"/>
-        </w:rPr>
-        <w:t xml:space="preserve">New players do not know what prestige, assets or offline income mean.</w:t>
-      </w:r>
-    </w:p>
-    <w:p>
-      <w:pPr>
-        <w:keepNext/>
-        <w:spacing w:after="60" w:before="80"/>
-      </w:pPr>
-      <w:r>
-        <w:rPr>
-          <w:rFonts w:ascii="Calibri" w:cs="Calibri" w:eastAsia="Calibri" w:hAnsi="Calibri"/>
-          <w:b/>
-          <w:bCs/>
-          <w:sz w:val="22"/>
-          <w:szCs w:val="22"/>
-        </w:rPr>
-        <w:t xml:space="preserve">What it does</w:t>
-      </w:r>
-    </w:p>
-    <w:p>
-      <w:pPr>
-        <w:pStyle w:val="ListParagraph"/>
-        <w:numPr>
-          <w:ilvl w:val="0"/>
-          <w:numId w:val="2"/>
-        </w:numPr>
-        <w:spacing w:after="60"/>
-      </w:pPr>
-      <w:r>
-        <w:rPr>
-          <w:rFonts w:ascii="Calibri" w:cs="Calibri" w:eastAsia="Calibri" w:hAnsi="Calibri"/>
-          <w:sz w:val="22"/>
-          <w:szCs w:val="22"/>
-        </w:rPr>
-        <w:t xml:space="preserve">A short guided first session: open your first business, buy an asset, see income grow, learn about prestige.</w:t>
-      </w:r>
-    </w:p>
-    <w:p>
-      <w:pPr>
-        <w:pStyle w:val="ListParagraph"/>
-        <w:numPr>
-          <w:ilvl w:val="0"/>
-          <w:numId w:val="2"/>
-        </w:numPr>
-        <w:spacing w:after="60"/>
-      </w:pPr>
-      <w:r>
-        <w:rPr>
-          <w:rFonts w:ascii="Calibri" w:cs="Calibri" w:eastAsia="Calibri" w:hAnsi="Calibri"/>
-          <w:sz w:val="22"/>
-          <w:szCs w:val="22"/>
-        </w:rPr>
-        <w:t xml:space="preserve">Can be skipped and replayed from the profile.</w:t>
-      </w:r>
-    </w:p>
-    <w:p>
-      <w:pPr>
-        <w:keepNext/>
-        <w:spacing w:after="60" w:before="80"/>
-      </w:pPr>
-      <w:r>
-        <w:rPr>
-          <w:rFonts w:ascii="Calibri" w:cs="Calibri" w:eastAsia="Calibri" w:hAnsi="Calibri"/>
-          <w:b/>
-          <w:bCs/>
-          <w:sz w:val="22"/>
-          <w:szCs w:val="22"/>
-        </w:rPr>
-        <w:t xml:space="preserve">How</w:t>
-      </w:r>
-    </w:p>
-    <w:p>
-      <w:pPr>
-        <w:pStyle w:val="ListParagraph"/>
-        <w:numPr>
-          <w:ilvl w:val="0"/>
-          <w:numId w:val="2"/>
-        </w:numPr>
-        <w:spacing w:after="60"/>
-      </w:pPr>
-      <w:r>
-        <w:rPr>
-          <w:rFonts w:ascii="Calibri" w:cs="Calibri" w:eastAsia="Calibri" w:hAnsi="Calibri"/>
-          <w:sz w:val="22"/>
-          <w:szCs w:val="22"/>
-        </w:rPr>
-        <w:t xml:space="preserve">Frontend only: a step-by-step overlay pointing at real buttons; progress kept per player.</w:t>
-      </w:r>
-    </w:p>
-    <w:p>
-      <w:pPr>
-        <w:spacing w:after="80"/>
-      </w:pPr>
-      <w:r>
-        <w:rPr>
-          <w:rFonts w:ascii="Calibri" w:cs="Calibri" w:eastAsia="Calibri" w:hAnsi="Calibri"/>
-          <w:b/>
-          <w:bCs/>
-          <w:sz w:val="22"/>
-          <w:szCs w:val="22"/>
-        </w:rPr>
-        <w:t xml:space="preserve">Depends on: </w:t>
-      </w:r>
-      <w:r>
-        <w:rPr>
-          <w:rFonts w:ascii="Calibri" w:cs="Calibri" w:eastAsia="Calibri" w:hAnsi="Calibri"/>
-          <w:sz w:val="22"/>
-          <w:szCs w:val="22"/>
-        </w:rPr>
-        <w:t xml:space="preserve">None</w:t>
-      </w:r>
-    </w:p>
-    <w:p>
-      <w:pPr>
-        <w:pStyle w:val="Heading2"/>
-        <w:keepNext/>
-        <w:spacing w:after="120" w:before="320"/>
-      </w:pPr>
-      <w:r>
-        <w:rPr>
-          <w:rFonts w:ascii="Calibri" w:cs="Calibri" w:eastAsia="Calibri" w:hAnsi="Calibri"/>
-          <w:color w:val="4F46E5"/>
-        </w:rPr>
-        <w:t xml:space="preserve">Feature 16 — Statistics and charts</w:t>
-      </w:r>
-    </w:p>
-    <w:p>
-      <w:pPr>
-        <w:keepNext/>
-        <w:spacing w:after="120"/>
-      </w:pPr>
+        <w:t xml:space="preserve">Priority: Low</w:t>
+      </w:r>
       <w:r>
         <w:rPr>
           <w:rFonts w:ascii="Calibri" w:cs="Calibri" w:eastAsia="Calibri" w:hAnsi="Calibri"/>
@@ -6421,27 +7711,7 @@
           <w:sz w:val="20"/>
           <w:szCs w:val="20"/>
         </w:rPr>
-        <w:t xml:space="preserve">Platform  ·  </w:t>
-      </w:r>
-      <w:r>
-        <w:rPr>
-          <w:rFonts w:ascii="Calibri" w:cs="Calibri" w:eastAsia="Calibri" w:hAnsi="Calibri"/>
-          <w:b/>
-          <w:bCs/>
-          <w:color w:val="64748B"/>
-          <w:sz w:val="20"/>
-          <w:szCs w:val="20"/>
-        </w:rPr>
-        <w:t xml:space="preserve">Priority: Low</w:t>
-      </w:r>
-      <w:r>
-        <w:rPr>
-          <w:rFonts w:ascii="Calibri" w:cs="Calibri" w:eastAsia="Calibri" w:hAnsi="Calibri"/>
-          <w:color w:val="64748B"/>
-          <w:sz w:val="20"/>
-          <w:szCs w:val="20"/>
-        </w:rPr>
-        <w:t xml:space="preserve">  ·  Effort: Medium (1–2 weeks)</w:t>
+        <w:t xml:space="preserve">  ·  Effort: Large (weeks)</w:t>
       </w:r>
     </w:p>
     <w:p>
@@ -6464,7 +7734,7 @@
           <w:sz w:val="22"/>
           <w:szCs w:val="22"/>
         </w:rPr>
-        <w:t xml:space="preserve">Seeing growth is satisfying and helps players plan.</w:t>
+        <w:t xml:space="preserve">Social pressure and cooperation keep players around longer.</w:t>
       </w:r>
     </w:p>
     <w:p>
@@ -6498,7 +7768,7 @@
           <w:sz w:val="22"/>
           <w:szCs w:val="22"/>
         </w:rPr>
-        <w:t xml:space="preserve">Charts: income per second over time, earnings per business, net worth history.</w:t>
+        <w:t xml:space="preserve">Add friends and compare progress; form alliances (guilds) with a shared weekly goal and a group reward.</w:t>
       </w:r>
     </w:p>
     <w:p>
@@ -6532,7 +7802,7 @@
           <w:sz w:val="22"/>
           <w:szCs w:val="22"/>
         </w:rPr>
-        <w:t xml:space="preserve">Backend: periodic snapshots of key numbers per company.</w:t>
+        <w:t xml:space="preserve">Backend: friendships and alliances tables, invitations, alliance goal progress.</w:t>
       </w:r>
     </w:p>
     <w:p>
@@ -6550,7 +7820,7 @@
           <w:sz w:val="22"/>
           <w:szCs w:val="22"/>
         </w:rPr>
-        <w:t xml:space="preserve">Frontend: a Stats page with charts.</w:t>
+        <w:t xml:space="preserve">Frontend: Friends and Alliance pages.</w:t>
       </w:r>
     </w:p>
     <w:p>
@@ -6573,568 +7843,7 @@
           <w:sz w:val="22"/>
           <w:szCs w:val="22"/>
         </w:rPr>
-        <w:t xml:space="preserve">None</w:t>
-      </w:r>
-    </w:p>
-    <w:p>
-      <w:pPr>
-        <w:pStyle w:val="Heading2"/>
-        <w:keepNext/>
-        <w:spacing w:after="120" w:before="320"/>
-      </w:pPr>
-      <w:r>
-        <w:rPr>
-          <w:rFonts w:ascii="Calibri" w:cs="Calibri" w:eastAsia="Calibri" w:hAnsi="Calibri"/>
-          <w:color w:val="4F46E5"/>
-        </w:rPr>
-        <w:t xml:space="preserve">Feature 17 — French and Arabic languages</w:t>
-      </w:r>
-    </w:p>
-    <w:p>
-      <w:pPr>
-        <w:keepNext/>
-        <w:spacing w:after="120"/>
-      </w:pPr>
-      <w:r>
-        <w:rPr>
-          <w:rFonts w:ascii="Calibri" w:cs="Calibri" w:eastAsia="Calibri" w:hAnsi="Calibri"/>
-          <w:color w:val="64748B"/>
-          <w:sz w:val="20"/>
-          <w:szCs w:val="20"/>
-        </w:rPr>
-        <w:t xml:space="preserve">Platform  ·  </w:t>
-      </w:r>
-      <w:r>
-        <w:rPr>
-          <w:rFonts w:ascii="Calibri" w:cs="Calibri" w:eastAsia="Calibri" w:hAnsi="Calibri"/>
-          <w:b/>
-          <w:bCs/>
-          <w:color w:val="B45309"/>
-          <w:sz w:val="20"/>
-          <w:szCs w:val="20"/>
-        </w:rPr>
-        <w:t xml:space="preserve">Priority: Medium</w:t>
-      </w:r>
-      <w:r>
-        <w:rPr>
-          <w:rFonts w:ascii="Calibri" w:cs="Calibri" w:eastAsia="Calibri" w:hAnsi="Calibri"/>
-          <w:color w:val="64748B"/>
-          <w:sz w:val="20"/>
-          <w:szCs w:val="20"/>
-        </w:rPr>
-        <w:t xml:space="preserve">  ·  Effort: Medium (1–2 weeks)</w:t>
-      </w:r>
-    </w:p>
-    <w:p>
-      <w:pPr>
-        <w:spacing w:after="80"/>
-      </w:pPr>
-      <w:r>
-        <w:rPr>
-          <w:rFonts w:ascii="Calibri" w:cs="Calibri" w:eastAsia="Calibri" w:hAnsi="Calibri"/>
-          <w:b/>
-          <w:bCs/>
-          <w:sz w:val="22"/>
-          <w:szCs w:val="22"/>
-        </w:rPr>
-        <w:t xml:space="preserve">Why: </w:t>
-      </w:r>
-      <w:r>
-        <w:rPr>
-          <w:rFonts w:ascii="Calibri" w:cs="Calibri" w:eastAsia="Calibri" w:hAnsi="Calibri"/>
-          <w:sz w:val="22"/>
-          <w:szCs w:val="22"/>
-        </w:rPr>
-        <w:t xml:space="preserve">The player base starts in Tunisia; French and Arabic make the game accessible to everyone there.</w:t>
-      </w:r>
-    </w:p>
-    <w:p>
-      <w:pPr>
-        <w:keepNext/>
-        <w:spacing w:after="60" w:before="80"/>
-      </w:pPr>
-      <w:r>
-        <w:rPr>
-          <w:rFonts w:ascii="Calibri" w:cs="Calibri" w:eastAsia="Calibri" w:hAnsi="Calibri"/>
-          <w:b/>
-          <w:bCs/>
-          <w:sz w:val="22"/>
-          <w:szCs w:val="22"/>
-        </w:rPr>
-        <w:t xml:space="preserve">What it does</w:t>
-      </w:r>
-    </w:p>
-    <w:p>
-      <w:pPr>
-        <w:pStyle w:val="ListParagraph"/>
-        <w:numPr>
-          <w:ilvl w:val="0"/>
-          <w:numId w:val="2"/>
-        </w:numPr>
-        <w:spacing w:after="60"/>
-      </w:pPr>
-      <w:r>
-        <w:rPr>
-          <w:rFonts w:ascii="Calibri" w:cs="Calibri" w:eastAsia="Calibri" w:hAnsi="Calibri"/>
-          <w:sz w:val="22"/>
-          <w:szCs w:val="22"/>
-        </w:rPr>
-        <w:t xml:space="preserve">Language switcher: English, Français, العربية (right-to-left layout for Arabic).</w:t>
-      </w:r>
-    </w:p>
-    <w:p>
-      <w:pPr>
-        <w:pStyle w:val="ListParagraph"/>
-        <w:numPr>
-          <w:ilvl w:val="0"/>
-          <w:numId w:val="2"/>
-        </w:numPr>
-        <w:spacing w:after="60"/>
-      </w:pPr>
-      <w:r>
-        <w:rPr>
-          <w:rFonts w:ascii="Calibri" w:cs="Calibri" w:eastAsia="Calibri" w:hAnsi="Calibri"/>
-          <w:sz w:val="22"/>
-          <w:szCs w:val="22"/>
-        </w:rPr>
-        <w:t xml:space="preserve">Money formatting follows the chosen language.</w:t>
-      </w:r>
-    </w:p>
-    <w:p>
-      <w:pPr>
-        <w:keepNext/>
-        <w:spacing w:after="60" w:before="80"/>
-      </w:pPr>
-      <w:r>
-        <w:rPr>
-          <w:rFonts w:ascii="Calibri" w:cs="Calibri" w:eastAsia="Calibri" w:hAnsi="Calibri"/>
-          <w:b/>
-          <w:bCs/>
-          <w:sz w:val="22"/>
-          <w:szCs w:val="22"/>
-        </w:rPr>
-        <w:t xml:space="preserve">How</w:t>
-      </w:r>
-    </w:p>
-    <w:p>
-      <w:pPr>
-        <w:pStyle w:val="ListParagraph"/>
-        <w:numPr>
-          <w:ilvl w:val="0"/>
-          <w:numId w:val="2"/>
-        </w:numPr>
-        <w:spacing w:after="60"/>
-      </w:pPr>
-      <w:r>
-        <w:rPr>
-          <w:rFonts w:ascii="Calibri" w:cs="Calibri" w:eastAsia="Calibri" w:hAnsi="Calibri"/>
-          <w:sz w:val="22"/>
-          <w:szCs w:val="22"/>
-        </w:rPr>
-        <w:t xml:space="preserve">Frontend: Angular i18n; the light design already uses logical spacing that adapts well to RTL.</w:t>
-      </w:r>
-    </w:p>
-    <w:p>
-      <w:pPr>
-        <w:pStyle w:val="ListParagraph"/>
-        <w:numPr>
-          <w:ilvl w:val="0"/>
-          <w:numId w:val="2"/>
-        </w:numPr>
-        <w:spacing w:after="60"/>
-      </w:pPr>
-      <w:r>
-        <w:rPr>
-          <w:rFonts w:ascii="Calibri" w:cs="Calibri" w:eastAsia="Calibri" w:hAnsi="Calibri"/>
-          <w:sz w:val="22"/>
-          <w:szCs w:val="22"/>
-        </w:rPr>
-        <w:t xml:space="preserve">Backend: error messages become codes the frontend translates (they are plain English strings today).</w:t>
-      </w:r>
-    </w:p>
-    <w:p>
-      <w:pPr>
-        <w:spacing w:after="80"/>
-      </w:pPr>
-      <w:r>
-        <w:rPr>
-          <w:rFonts w:ascii="Calibri" w:cs="Calibri" w:eastAsia="Calibri" w:hAnsi="Calibri"/>
-          <w:b/>
-          <w:bCs/>
-          <w:sz w:val="22"/>
-          <w:szCs w:val="22"/>
-        </w:rPr>
-        <w:t xml:space="preserve">Depends on: </w:t>
-      </w:r>
-      <w:r>
-        <w:rPr>
-          <w:rFonts w:ascii="Calibri" w:cs="Calibri" w:eastAsia="Calibri" w:hAnsi="Calibri"/>
-          <w:sz w:val="22"/>
-          <w:szCs w:val="22"/>
-        </w:rPr>
-        <w:t xml:space="preserve">None</w:t>
-      </w:r>
-    </w:p>
-    <w:p>
-      <w:pPr>
-        <w:pStyle w:val="Heading2"/>
-        <w:keepNext/>
-        <w:spacing w:after="120" w:before="320"/>
-      </w:pPr>
-      <w:r>
-        <w:rPr>
-          <w:rFonts w:ascii="Calibri" w:cs="Calibri" w:eastAsia="Calibri" w:hAnsi="Calibri"/>
-          <w:color w:val="4F46E5"/>
-        </w:rPr>
-        <w:t xml:space="preserve">Feature 18 — Dark mode</w:t>
-      </w:r>
-    </w:p>
-    <w:p>
-      <w:pPr>
-        <w:keepNext/>
-        <w:spacing w:after="120"/>
-      </w:pPr>
-      <w:r>
-        <w:rPr>
-          <w:rFonts w:ascii="Calibri" w:cs="Calibri" w:eastAsia="Calibri" w:hAnsi="Calibri"/>
-          <w:color w:val="64748B"/>
-          <w:sz w:val="20"/>
-          <w:szCs w:val="20"/>
-        </w:rPr>
-        <w:t xml:space="preserve">Platform  ·  </w:t>
-      </w:r>
-      <w:r>
-        <w:rPr>
-          <w:rFonts w:ascii="Calibri" w:cs="Calibri" w:eastAsia="Calibri" w:hAnsi="Calibri"/>
-          <w:b/>
-          <w:bCs/>
-          <w:color w:val="64748B"/>
-          <w:sz w:val="20"/>
-          <w:szCs w:val="20"/>
-        </w:rPr>
-        <w:t xml:space="preserve">Priority: Low</w:t>
-      </w:r>
-      <w:r>
-        <w:rPr>
-          <w:rFonts w:ascii="Calibri" w:cs="Calibri" w:eastAsia="Calibri" w:hAnsi="Calibri"/>
-          <w:color w:val="64748B"/>
-          <w:sz w:val="20"/>
-          <w:szCs w:val="20"/>
-        </w:rPr>
-        <w:t xml:space="preserve">  ·  Effort: Small (days)</w:t>
-      </w:r>
-    </w:p>
-    <w:p>
-      <w:pPr>
-        <w:spacing w:after="80"/>
-      </w:pPr>
-      <w:r>
-        <w:rPr>
-          <w:rFonts w:ascii="Calibri" w:cs="Calibri" w:eastAsia="Calibri" w:hAnsi="Calibri"/>
-          <w:b/>
-          <w:bCs/>
-          <w:sz w:val="22"/>
-          <w:szCs w:val="22"/>
-        </w:rPr>
-        <w:t xml:space="preserve">Why: </w:t>
-      </w:r>
-      <w:r>
-        <w:rPr>
-          <w:rFonts w:ascii="Calibri" w:cs="Calibri" w:eastAsia="Calibri" w:hAnsi="Calibri"/>
-          <w:sz w:val="22"/>
-          <w:szCs w:val="22"/>
-        </w:rPr>
-        <w:t xml:space="preserve">Many players play at night.</w:t>
-      </w:r>
-    </w:p>
-    <w:p>
-      <w:pPr>
-        <w:keepNext/>
-        <w:spacing w:after="60" w:before="80"/>
-      </w:pPr>
-      <w:r>
-        <w:rPr>
-          <w:rFonts w:ascii="Calibri" w:cs="Calibri" w:eastAsia="Calibri" w:hAnsi="Calibri"/>
-          <w:b/>
-          <w:bCs/>
-          <w:sz w:val="22"/>
-          <w:szCs w:val="22"/>
-        </w:rPr>
-        <w:t xml:space="preserve">What it does</w:t>
-      </w:r>
-    </w:p>
-    <w:p>
-      <w:pPr>
-        <w:pStyle w:val="ListParagraph"/>
-        <w:numPr>
-          <w:ilvl w:val="0"/>
-          <w:numId w:val="2"/>
-        </w:numPr>
-        <w:spacing w:after="60"/>
-      </w:pPr>
-      <w:r>
-        <w:rPr>
-          <w:rFonts w:ascii="Calibri" w:cs="Calibri" w:eastAsia="Calibri" w:hAnsi="Calibri"/>
-          <w:sz w:val="22"/>
-          <w:szCs w:val="22"/>
-        </w:rPr>
-        <w:t xml:space="preserve">Light / dark / system toggle in the header.</w:t>
-      </w:r>
-    </w:p>
-    <w:p>
-      <w:pPr>
-        <w:keepNext/>
-        <w:spacing w:after="60" w:before="80"/>
-      </w:pPr>
-      <w:r>
-        <w:rPr>
-          <w:rFonts w:ascii="Calibri" w:cs="Calibri" w:eastAsia="Calibri" w:hAnsi="Calibri"/>
-          <w:b/>
-          <w:bCs/>
-          <w:sz w:val="22"/>
-          <w:szCs w:val="22"/>
-        </w:rPr>
-        <w:t xml:space="preserve">How</w:t>
-      </w:r>
-    </w:p>
-    <w:p>
-      <w:pPr>
-        <w:pStyle w:val="ListParagraph"/>
-        <w:numPr>
-          <w:ilvl w:val="0"/>
-          <w:numId w:val="2"/>
-        </w:numPr>
-        <w:spacing w:after="60"/>
-      </w:pPr>
-      <w:r>
-        <w:rPr>
-          <w:rFonts w:ascii="Calibri" w:cs="Calibri" w:eastAsia="Calibri" w:hAnsi="Calibri"/>
-          <w:sz w:val="22"/>
-          <w:szCs w:val="22"/>
-        </w:rPr>
-        <w:t xml:space="preserve">Frontend only: the design system already uses colour tokens in styles.scss, so dark mode is a second set of token values.</w:t>
-      </w:r>
-    </w:p>
-    <w:p>
-      <w:pPr>
-        <w:spacing w:after="80"/>
-      </w:pPr>
-      <w:r>
-        <w:rPr>
-          <w:rFonts w:ascii="Calibri" w:cs="Calibri" w:eastAsia="Calibri" w:hAnsi="Calibri"/>
-          <w:b/>
-          <w:bCs/>
-          <w:sz w:val="22"/>
-          <w:szCs w:val="22"/>
-        </w:rPr>
-        <w:t xml:space="preserve">Depends on: </w:t>
-      </w:r>
-      <w:r>
-        <w:rPr>
-          <w:rFonts w:ascii="Calibri" w:cs="Calibri" w:eastAsia="Calibri" w:hAnsi="Calibri"/>
-          <w:sz w:val="22"/>
-          <w:szCs w:val="22"/>
-        </w:rPr>
-        <w:t xml:space="preserve">None</w:t>
-      </w:r>
-    </w:p>
-    <w:p>
-      <w:pPr>
-        <w:pStyle w:val="Heading2"/>
-        <w:keepNext/>
-        <w:spacing w:after="120" w:before="320"/>
-      </w:pPr>
-      <w:r>
-        <w:rPr>
-          <w:rFonts w:ascii="Calibri" w:cs="Calibri" w:eastAsia="Calibri" w:hAnsi="Calibri"/>
-          <w:color w:val="4F46E5"/>
-        </w:rPr>
-        <w:t xml:space="preserve">Feature 19 — Account security</w:t>
-      </w:r>
-    </w:p>
-    <w:p>
-      <w:pPr>
-        <w:keepNext/>
-        <w:spacing w:after="120"/>
-      </w:pPr>
-      <w:r>
-        <w:rPr>
-          <w:rFonts w:ascii="Calibri" w:cs="Calibri" w:eastAsia="Calibri" w:hAnsi="Calibri"/>
-          <w:color w:val="64748B"/>
-          <w:sz w:val="20"/>
-          <w:szCs w:val="20"/>
-        </w:rPr>
-        <w:t xml:space="preserve">Platform  ·  </w:t>
-      </w:r>
-      <w:r>
-        <w:rPr>
-          <w:rFonts w:ascii="Calibri" w:cs="Calibri" w:eastAsia="Calibri" w:hAnsi="Calibri"/>
-          <w:b/>
-          <w:bCs/>
-          <w:color w:val="B91C1C"/>
-          <w:sz w:val="20"/>
-          <w:szCs w:val="20"/>
-        </w:rPr>
-        <w:t xml:space="preserve">Priority: High</w:t>
-      </w:r>
-      <w:r>
-        <w:rPr>
-          <w:rFonts w:ascii="Calibri" w:cs="Calibri" w:eastAsia="Calibri" w:hAnsi="Calibri"/>
-          <w:color w:val="64748B"/>
-          <w:sz w:val="20"/>
-          <w:szCs w:val="20"/>
-        </w:rPr>
-        <w:t xml:space="preserve">  ·  Effort: Medium (1–2 weeks)</w:t>
-      </w:r>
-    </w:p>
-    <w:p>
-      <w:pPr>
-        <w:spacing w:after="80"/>
-      </w:pPr>
-      <w:r>
-        <w:rPr>
-          <w:rFonts w:ascii="Calibri" w:cs="Calibri" w:eastAsia="Calibri" w:hAnsi="Calibri"/>
-          <w:b/>
-          <w:bCs/>
-          <w:sz w:val="22"/>
-          <w:szCs w:val="22"/>
-        </w:rPr>
-        <w:t xml:space="preserve">Why: </w:t>
-      </w:r>
-      <w:r>
-        <w:rPr>
-          <w:rFonts w:ascii="Calibri" w:cs="Calibri" w:eastAsia="Calibri" w:hAnsi="Calibri"/>
-          <w:sz w:val="22"/>
-          <w:szCs w:val="22"/>
-        </w:rPr>
-        <w:t xml:space="preserve">Required before real players join.</w:t>
-      </w:r>
-    </w:p>
-    <w:p>
-      <w:pPr>
-        <w:keepNext/>
-        <w:spacing w:after="60" w:before="80"/>
-      </w:pPr>
-      <w:r>
-        <w:rPr>
-          <w:rFonts w:ascii="Calibri" w:cs="Calibri" w:eastAsia="Calibri" w:hAnsi="Calibri"/>
-          <w:b/>
-          <w:bCs/>
-          <w:sz w:val="22"/>
-          <w:szCs w:val="22"/>
-        </w:rPr>
-        <w:t xml:space="preserve">What it does</w:t>
-      </w:r>
-    </w:p>
-    <w:p>
-      <w:pPr>
-        <w:pStyle w:val="ListParagraph"/>
-        <w:numPr>
-          <w:ilvl w:val="0"/>
-          <w:numId w:val="2"/>
-        </w:numPr>
-        <w:spacing w:after="60"/>
-      </w:pPr>
-      <w:r>
-        <w:rPr>
-          <w:rFonts w:ascii="Calibri" w:cs="Calibri" w:eastAsia="Calibri" w:hAnsi="Calibri"/>
-          <w:sz w:val="22"/>
-          <w:szCs w:val="22"/>
-        </w:rPr>
-        <w:t xml:space="preserve">Password reset by email, email verification, a minimum password strength.</w:t>
-      </w:r>
-    </w:p>
-    <w:p>
-      <w:pPr>
-        <w:pStyle w:val="ListParagraph"/>
-        <w:numPr>
-          <w:ilvl w:val="0"/>
-          <w:numId w:val="2"/>
-        </w:numPr>
-        <w:spacing w:after="60"/>
-      </w:pPr>
-      <w:r>
-        <w:rPr>
-          <w:rFonts w:ascii="Calibri" w:cs="Calibri" w:eastAsia="Calibri" w:hAnsi="Calibri"/>
-          <w:sz w:val="22"/>
-          <w:szCs w:val="22"/>
-        </w:rPr>
-        <w:t xml:space="preserve">Server-side validation on registration (today a blank username crashes with a 500 error — see contract "Known gaps").</w:t>
-      </w:r>
-    </w:p>
-    <w:p>
-      <w:pPr>
-        <w:keepNext/>
-        <w:spacing w:after="60" w:before="80"/>
-      </w:pPr>
-      <w:r>
-        <w:rPr>
-          <w:rFonts w:ascii="Calibri" w:cs="Calibri" w:eastAsia="Calibri" w:hAnsi="Calibri"/>
-          <w:b/>
-          <w:bCs/>
-          <w:sz w:val="22"/>
-          <w:szCs w:val="22"/>
-        </w:rPr>
-        <w:t xml:space="preserve">How</w:t>
-      </w:r>
-    </w:p>
-    <w:p>
-      <w:pPr>
-        <w:pStyle w:val="ListParagraph"/>
-        <w:numPr>
-          <w:ilvl w:val="0"/>
-          <w:numId w:val="2"/>
-        </w:numPr>
-        <w:spacing w:after="60"/>
-      </w:pPr>
-      <w:r>
-        <w:rPr>
-          <w:rFonts w:ascii="Calibri" w:cs="Calibri" w:eastAsia="Calibri" w:hAnsi="Calibri"/>
-          <w:sz w:val="22"/>
-          <w:szCs w:val="22"/>
-        </w:rPr>
-        <w:t xml:space="preserve">Backend: validation in AuthService, an email sender, reset tokens.</w:t>
-      </w:r>
-    </w:p>
-    <w:p>
-      <w:pPr>
-        <w:pStyle w:val="ListParagraph"/>
-        <w:numPr>
-          <w:ilvl w:val="0"/>
-          <w:numId w:val="2"/>
-        </w:numPr>
-        <w:spacing w:after="60"/>
-      </w:pPr>
-      <w:r>
-        <w:rPr>
-          <w:rFonts w:ascii="Calibri" w:cs="Calibri" w:eastAsia="Calibri" w:hAnsi="Calibri"/>
-          <w:sz w:val="22"/>
-          <w:szCs w:val="22"/>
-        </w:rPr>
-        <w:t xml:space="preserve">Frontend: "Forgot password?" flow and inline validation messages.</w:t>
-      </w:r>
-    </w:p>
-    <w:p>
-      <w:pPr>
-        <w:spacing w:after="80"/>
-      </w:pPr>
-      <w:r>
-        <w:rPr>
-          <w:rFonts w:ascii="Calibri" w:cs="Calibri" w:eastAsia="Calibri" w:hAnsi="Calibri"/>
-          <w:b/>
-          <w:bCs/>
-          <w:sz w:val="22"/>
-          <w:szCs w:val="22"/>
-        </w:rPr>
-        <w:t xml:space="preserve">Depends on: </w:t>
-      </w:r>
-      <w:r>
-        <w:rPr>
-          <w:rFonts w:ascii="Calibri" w:cs="Calibri" w:eastAsia="Calibri" w:hAnsi="Calibri"/>
-          <w:sz w:val="22"/>
-          <w:szCs w:val="22"/>
-        </w:rPr>
-        <w:t xml:space="preserve">An email provider</w:t>
+        <w:t xml:space="preserve">Public player profiles (feature 7)</w:t>
       </w:r>
     </w:p>
     <w:sectPr>

</xml_diff>